<commit_message>
Symbol for NOT gate
Learned creating new symbol in LTSpice. Updated Symbol for NOT gate in Transmission gate
</commit_message>
<xml_diff>
--- a/Transmission Gate.docx
+++ b/Transmission Gate.docx
@@ -61,43 +61,7 @@
           <w:sz w:val="28"/>
           <w:szCs w:val="28"/>
         </w:rPr>
-        <w:t xml:space="preserve">Since, </w:t>
-      </w:r>
-      <w:proofErr w:type="spellStart"/>
-      <w:r>
-        <w:rPr>
-          <w:rFonts w:ascii="Times New Roman" w:hAnsi="Times New Roman" w:cs="Times New Roman"/>
-          <w:sz w:val="28"/>
-          <w:szCs w:val="28"/>
-        </w:rPr>
-        <w:t>nMOS</w:t>
-      </w:r>
-      <w:proofErr w:type="spellEnd"/>
-      <w:r>
-        <w:rPr>
-          <w:rFonts w:ascii="Times New Roman" w:hAnsi="Times New Roman" w:cs="Times New Roman"/>
-          <w:sz w:val="28"/>
-          <w:szCs w:val="28"/>
-        </w:rPr>
-        <w:t xml:space="preserve"> acts as a perfect switch for logic 0 and </w:t>
-      </w:r>
-      <w:proofErr w:type="spellStart"/>
-      <w:r>
-        <w:rPr>
-          <w:rFonts w:ascii="Times New Roman" w:hAnsi="Times New Roman" w:cs="Times New Roman"/>
-          <w:sz w:val="28"/>
-          <w:szCs w:val="28"/>
-        </w:rPr>
-        <w:t>pMOS</w:t>
-      </w:r>
-      <w:proofErr w:type="spellEnd"/>
-      <w:r>
-        <w:rPr>
-          <w:rFonts w:ascii="Times New Roman" w:hAnsi="Times New Roman" w:cs="Times New Roman"/>
-          <w:sz w:val="28"/>
-          <w:szCs w:val="28"/>
-        </w:rPr>
-        <w:t xml:space="preserve"> acts as a perfect switch for logic 1. A transmission gate contains a combination of both.</w:t>
+        <w:t>Since, nMOS acts as a perfect switch for logic 0 and pMOS acts as a perfect switch for logic 1. A transmission gate contains a combination of both.</w:t>
       </w:r>
       <w:r>
         <w:rPr>
@@ -246,115 +210,7 @@
           <w:sz w:val="28"/>
           <w:szCs w:val="28"/>
         </w:rPr>
-        <w:t xml:space="preserve">When logic 1 is applied to control signal, </w:t>
-      </w:r>
-      <w:proofErr w:type="spellStart"/>
-      <w:r>
-        <w:rPr>
-          <w:rFonts w:ascii="Times New Roman" w:hAnsi="Times New Roman" w:cs="Times New Roman"/>
-          <w:sz w:val="28"/>
-          <w:szCs w:val="28"/>
-        </w:rPr>
-        <w:t>nMOS</w:t>
-      </w:r>
-      <w:proofErr w:type="spellEnd"/>
-      <w:r>
-        <w:rPr>
-          <w:rFonts w:ascii="Times New Roman" w:hAnsi="Times New Roman" w:cs="Times New Roman"/>
-          <w:sz w:val="28"/>
-          <w:szCs w:val="28"/>
-        </w:rPr>
-        <w:t xml:space="preserve"> turns ON and due to inverter connected to </w:t>
-      </w:r>
-      <w:proofErr w:type="spellStart"/>
-      <w:r>
-        <w:rPr>
-          <w:rFonts w:ascii="Times New Roman" w:hAnsi="Times New Roman" w:cs="Times New Roman"/>
-          <w:sz w:val="28"/>
-          <w:szCs w:val="28"/>
-        </w:rPr>
-        <w:t>pMOS</w:t>
-      </w:r>
-      <w:proofErr w:type="spellEnd"/>
-      <w:r>
-        <w:rPr>
-          <w:rFonts w:ascii="Times New Roman" w:hAnsi="Times New Roman" w:cs="Times New Roman"/>
-          <w:sz w:val="28"/>
-          <w:szCs w:val="28"/>
-        </w:rPr>
-        <w:t xml:space="preserve">, </w:t>
-      </w:r>
-      <w:proofErr w:type="spellStart"/>
-      <w:r>
-        <w:rPr>
-          <w:rFonts w:ascii="Times New Roman" w:hAnsi="Times New Roman" w:cs="Times New Roman"/>
-          <w:sz w:val="28"/>
-          <w:szCs w:val="28"/>
-        </w:rPr>
-        <w:t>pMOS</w:t>
-      </w:r>
-      <w:proofErr w:type="spellEnd"/>
-      <w:r>
-        <w:rPr>
-          <w:rFonts w:ascii="Times New Roman" w:hAnsi="Times New Roman" w:cs="Times New Roman"/>
-          <w:sz w:val="28"/>
-          <w:szCs w:val="28"/>
-        </w:rPr>
-        <w:t xml:space="preserve"> receives logic 0 and it also turns on. If source is connected to logic 0 then </w:t>
-      </w:r>
-      <w:proofErr w:type="spellStart"/>
-      <w:r>
-        <w:rPr>
-          <w:rFonts w:ascii="Times New Roman" w:hAnsi="Times New Roman" w:cs="Times New Roman"/>
-          <w:sz w:val="28"/>
-          <w:szCs w:val="28"/>
-        </w:rPr>
-        <w:t>nMOS</w:t>
-      </w:r>
-      <w:proofErr w:type="spellEnd"/>
-      <w:r>
-        <w:rPr>
-          <w:rFonts w:ascii="Times New Roman" w:hAnsi="Times New Roman" w:cs="Times New Roman"/>
-          <w:sz w:val="28"/>
-          <w:szCs w:val="28"/>
-        </w:rPr>
-        <w:t xml:space="preserve"> acts as perfect switch and if source is connected to logic 1 then </w:t>
-      </w:r>
-      <w:proofErr w:type="spellStart"/>
-      <w:r>
-        <w:rPr>
-          <w:rFonts w:ascii="Times New Roman" w:hAnsi="Times New Roman" w:cs="Times New Roman"/>
-          <w:sz w:val="28"/>
-          <w:szCs w:val="28"/>
-        </w:rPr>
-        <w:t>pMOS</w:t>
-      </w:r>
-      <w:proofErr w:type="spellEnd"/>
-      <w:r>
-        <w:rPr>
-          <w:rFonts w:ascii="Times New Roman" w:hAnsi="Times New Roman" w:cs="Times New Roman"/>
-          <w:sz w:val="28"/>
-          <w:szCs w:val="28"/>
-        </w:rPr>
-        <w:t xml:space="preserve"> acts as a perfect switch and signal is transferred from source to drain without degradation. When logic 0 is applied to control signal, both the transistors </w:t>
-      </w:r>
-      <w:proofErr w:type="gramStart"/>
-      <w:r>
-        <w:rPr>
-          <w:rFonts w:ascii="Times New Roman" w:hAnsi="Times New Roman" w:cs="Times New Roman"/>
-          <w:sz w:val="28"/>
-          <w:szCs w:val="28"/>
-        </w:rPr>
-        <w:t>turns</w:t>
-      </w:r>
-      <w:proofErr w:type="gramEnd"/>
-      <w:r>
-        <w:rPr>
-          <w:rFonts w:ascii="Times New Roman" w:hAnsi="Times New Roman" w:cs="Times New Roman"/>
-          <w:sz w:val="28"/>
-          <w:szCs w:val="28"/>
-        </w:rPr>
-        <w:t xml:space="preserve"> off leaving the output unconnected from the input. This creating the state of high impedance (Z).</w:t>
+        <w:t>When logic 1 is applied to control signal, nMOS turns ON and due to inverter connected to pMOS, pMOS receives logic 0 and it also turns on. If source is connected to logic 0 then nMOS acts as perfect switch and if source is connected to logic 1 then pMOS acts as a perfect switch and signal is transferred from source to drain without degradation. When logic 0 is applied to control signal, both the transistors turns off leaving the output unconnected from the input. This creating the state of high impedance (Z).</w:t>
       </w:r>
     </w:p>
     <w:p>
@@ -817,6 +673,7 @@
           <w:rFonts w:ascii="Times New Roman" w:hAnsi="Times New Roman" w:cs="Times New Roman"/>
           <w:b/>
           <w:bCs/>
+          <w:noProof/>
           <w:sz w:val="28"/>
           <w:szCs w:val="28"/>
         </w:rPr>
@@ -872,18 +729,8 @@
           <w:sz w:val="28"/>
           <w:szCs w:val="28"/>
         </w:rPr>
-        <w:t xml:space="preserve">This simulation is performed on </w:t>
-      </w:r>
-      <w:proofErr w:type="spellStart"/>
-      <w:r>
-        <w:rPr>
-          <w:rFonts w:ascii="Times New Roman" w:hAnsi="Times New Roman" w:cs="Times New Roman"/>
-          <w:sz w:val="28"/>
-          <w:szCs w:val="28"/>
-        </w:rPr>
-        <w:t>LTSpice</w:t>
-      </w:r>
-      <w:proofErr w:type="spellEnd"/>
+        <w:t>This simulation is performed on LTSpice</w:t>
+      </w:r>
     </w:p>
     <w:p>
       <w:pPr>
@@ -994,10 +841,7 @@
           <w:szCs w:val="28"/>
         </w:rPr>
       </w:pPr>
-    </w:p>
-    <w:p>
-      <w:pPr>
-        <w:jc w:val="both"/>
+      <w:r>
         <w:rPr>
           <w:rFonts w:ascii="Times New Roman" w:hAnsi="Times New Roman" w:cs="Times New Roman"/>
           <w:b/>
@@ -1005,8 +849,41 @@
           <w:sz w:val="28"/>
           <w:szCs w:val="28"/>
         </w:rPr>
-      </w:pPr>
-      <w:r>
+        <w:lastRenderedPageBreak/>
+        <w:t>Explanation:</w:t>
+      </w:r>
+    </w:p>
+    <w:p>
+      <w:pPr>
+        <w:jc w:val="both"/>
+        <w:rPr>
+          <w:rFonts w:ascii="Times New Roman" w:hAnsi="Times New Roman" w:cs="Times New Roman"/>
+          <w:sz w:val="28"/>
+          <w:szCs w:val="28"/>
+        </w:rPr>
+      </w:pPr>
+      <w:r>
+        <w:rPr>
+          <w:rFonts w:ascii="Times New Roman" w:hAnsi="Times New Roman" w:cs="Times New Roman"/>
+          <w:sz w:val="28"/>
+          <w:szCs w:val="28"/>
+        </w:rPr>
+        <w:t>The upper portion of circuit contains the CMOS inverter and lower portion contains the transmission gate. Source of both the transistors is connected to VDD. In simulation, first waveform represents the input, second waveform represents the inverted input that is supplied to gate of pMOS and third waveform represents the output.</w:t>
+      </w:r>
+    </w:p>
+    <w:p>
+      <w:pPr>
+        <w:jc w:val="both"/>
+        <w:rPr>
+          <w:rFonts w:ascii="Times New Roman" w:hAnsi="Times New Roman" w:cs="Times New Roman"/>
+          <w:sz w:val="28"/>
+          <w:szCs w:val="28"/>
+        </w:rPr>
+      </w:pPr>
+    </w:p>
+    <w:p>
+      <w:pPr>
+        <w:jc w:val="both"/>
         <w:rPr>
           <w:rFonts w:ascii="Times New Roman" w:hAnsi="Times New Roman" w:cs="Times New Roman"/>
           <w:b/>
@@ -1014,58 +891,8 @@
           <w:sz w:val="28"/>
           <w:szCs w:val="28"/>
         </w:rPr>
-        <w:t>Explanation:</w:t>
-      </w:r>
-    </w:p>
-    <w:p>
-      <w:pPr>
-        <w:jc w:val="both"/>
-        <w:rPr>
-          <w:rFonts w:ascii="Times New Roman" w:hAnsi="Times New Roman" w:cs="Times New Roman"/>
-          <w:sz w:val="28"/>
-          <w:szCs w:val="28"/>
-        </w:rPr>
-      </w:pPr>
-      <w:r>
-        <w:rPr>
-          <w:rFonts w:ascii="Times New Roman" w:hAnsi="Times New Roman" w:cs="Times New Roman"/>
-          <w:sz w:val="28"/>
-          <w:szCs w:val="28"/>
-        </w:rPr>
-        <w:t xml:space="preserve">The upper portion of circuit contains the CMOS inverter and lower portion contains the transmission gate. Source of both the transistors is connected to VDD. In simulation, first waveform represents the input, second waveform represents the inverted input that is supplied to gate of </w:t>
-      </w:r>
-      <w:proofErr w:type="spellStart"/>
-      <w:r>
-        <w:rPr>
-          <w:rFonts w:ascii="Times New Roman" w:hAnsi="Times New Roman" w:cs="Times New Roman"/>
-          <w:sz w:val="28"/>
-          <w:szCs w:val="28"/>
-        </w:rPr>
-        <w:t>pMOS</w:t>
-      </w:r>
-      <w:proofErr w:type="spellEnd"/>
-      <w:r>
-        <w:rPr>
-          <w:rFonts w:ascii="Times New Roman" w:hAnsi="Times New Roman" w:cs="Times New Roman"/>
-          <w:sz w:val="28"/>
-          <w:szCs w:val="28"/>
-        </w:rPr>
-        <w:t xml:space="preserve"> and third waveform represents the output.</w:t>
-      </w:r>
-    </w:p>
-    <w:p>
-      <w:pPr>
-        <w:jc w:val="both"/>
-        <w:rPr>
-          <w:rFonts w:ascii="Times New Roman" w:hAnsi="Times New Roman" w:cs="Times New Roman"/>
-          <w:sz w:val="28"/>
-          <w:szCs w:val="28"/>
-        </w:rPr>
-      </w:pPr>
-    </w:p>
-    <w:p>
-      <w:pPr>
-        <w:jc w:val="both"/>
+      </w:pPr>
+      <w:r>
         <w:rPr>
           <w:rFonts w:ascii="Times New Roman" w:hAnsi="Times New Roman" w:cs="Times New Roman"/>
           <w:b/>
@@ -1073,8 +900,80 @@
           <w:sz w:val="28"/>
           <w:szCs w:val="28"/>
         </w:rPr>
-      </w:pPr>
-      <w:r>
+        <w:t>Challenges Faced:</w:t>
+      </w:r>
+    </w:p>
+    <w:p>
+      <w:pPr>
+        <w:jc w:val="both"/>
+        <w:rPr>
+          <w:rFonts w:ascii="Times New Roman" w:hAnsi="Times New Roman" w:cs="Times New Roman"/>
+          <w:sz w:val="28"/>
+          <w:szCs w:val="28"/>
+        </w:rPr>
+      </w:pPr>
+      <w:r>
+        <w:rPr>
+          <w:rFonts w:ascii="Times New Roman" w:hAnsi="Times New Roman" w:cs="Times New Roman"/>
+          <w:sz w:val="28"/>
+          <w:szCs w:val="28"/>
+        </w:rPr>
+        <w:t>Currently I am unfamiliar with the bulk pin of the transistor. I connected bulk pin wrongly many times. I tried to create a symbol for the CMOS inverter to simplify the transmission gate circuit, but it was not working. I will try it again. I forgot to pull down the output which was leading to incorrect results.</w:t>
+      </w:r>
+    </w:p>
+    <w:p>
+      <w:pPr>
+        <w:jc w:val="both"/>
+        <w:rPr>
+          <w:rFonts w:ascii="Times New Roman" w:hAnsi="Times New Roman" w:cs="Times New Roman"/>
+          <w:sz w:val="28"/>
+          <w:szCs w:val="28"/>
+        </w:rPr>
+      </w:pPr>
+      <w:r>
+        <w:rPr>
+          <w:rFonts w:ascii="Times New Roman" w:hAnsi="Times New Roman" w:cs="Times New Roman"/>
+          <w:sz w:val="28"/>
+          <w:szCs w:val="28"/>
+        </w:rPr>
+        <w:t xml:space="preserve">I learned that bulk pin of nMOS should be connected to ground and that of pMOS should be connected to high voltage, but for a standard MOSFET we have only three pins and this bulk pin is connected to the source pin inside the housing and hence can not be connected somewhere else. As learned from google, for making transmission gates ICs are used in which bulk of all nMOS </w:t>
+      </w:r>
+      <w:r>
+        <w:rPr>
+          <w:rFonts w:ascii="Times New Roman" w:hAnsi="Times New Roman" w:cs="Times New Roman"/>
+          <w:sz w:val="28"/>
+          <w:szCs w:val="28"/>
+        </w:rPr>
+        <w:t xml:space="preserve">transistors </w:t>
+      </w:r>
+      <w:r>
+        <w:rPr>
+          <w:rFonts w:ascii="Times New Roman" w:hAnsi="Times New Roman" w:cs="Times New Roman"/>
+          <w:sz w:val="28"/>
+          <w:szCs w:val="28"/>
+        </w:rPr>
+        <w:t xml:space="preserve">is connected to ground/ lowest voltage and bulk pin of all pMOS </w:t>
+      </w:r>
+      <w:r>
+        <w:rPr>
+          <w:rFonts w:ascii="Times New Roman" w:hAnsi="Times New Roman" w:cs="Times New Roman"/>
+          <w:sz w:val="28"/>
+          <w:szCs w:val="28"/>
+        </w:rPr>
+        <w:t xml:space="preserve">transistors </w:t>
+      </w:r>
+      <w:r>
+        <w:rPr>
+          <w:rFonts w:ascii="Times New Roman" w:hAnsi="Times New Roman" w:cs="Times New Roman"/>
+          <w:sz w:val="28"/>
+          <w:szCs w:val="28"/>
+        </w:rPr>
+        <w:t xml:space="preserve">is connected to VDD/ highest voltage. </w:t>
+      </w:r>
+    </w:p>
+    <w:p>
+      <w:pPr>
+        <w:jc w:val="both"/>
         <w:rPr>
           <w:rFonts w:ascii="Times New Roman" w:hAnsi="Times New Roman" w:cs="Times New Roman"/>
           <w:b/>
@@ -1082,198 +981,306 @@
           <w:sz w:val="28"/>
           <w:szCs w:val="28"/>
         </w:rPr>
-        <w:t>Challenges Faced:</w:t>
-      </w:r>
-    </w:p>
-    <w:p>
-      <w:pPr>
-        <w:jc w:val="both"/>
-        <w:rPr>
-          <w:rFonts w:ascii="Times New Roman" w:hAnsi="Times New Roman" w:cs="Times New Roman"/>
-          <w:sz w:val="28"/>
-          <w:szCs w:val="28"/>
-        </w:rPr>
-      </w:pPr>
-      <w:r>
-        <w:rPr>
-          <w:rFonts w:ascii="Times New Roman" w:hAnsi="Times New Roman" w:cs="Times New Roman"/>
-          <w:sz w:val="28"/>
-          <w:szCs w:val="28"/>
-        </w:rPr>
-        <w:t>Currently I am unfamiliar with the bulk pin of the transistor. I connected bulk pin wrongly many times. I tried to create a symbol for the CMOS inverter to simplify the transmission gate circuit, but it was not working. I will try it again. I forgot to pull down the output which was leading to incorrect results.</w:t>
-      </w:r>
-    </w:p>
-    <w:p>
-      <w:pPr>
-        <w:jc w:val="both"/>
-        <w:rPr>
-          <w:rFonts w:ascii="Times New Roman" w:hAnsi="Times New Roman" w:cs="Times New Roman"/>
-          <w:sz w:val="28"/>
-          <w:szCs w:val="28"/>
-        </w:rPr>
-      </w:pPr>
-      <w:r>
-        <w:rPr>
-          <w:rFonts w:ascii="Times New Roman" w:hAnsi="Times New Roman" w:cs="Times New Roman"/>
-          <w:sz w:val="28"/>
-          <w:szCs w:val="28"/>
-        </w:rPr>
-        <w:t xml:space="preserve">I learned that bulk pin of </w:t>
-      </w:r>
-      <w:proofErr w:type="spellStart"/>
-      <w:r>
-        <w:rPr>
-          <w:rFonts w:ascii="Times New Roman" w:hAnsi="Times New Roman" w:cs="Times New Roman"/>
-          <w:sz w:val="28"/>
-          <w:szCs w:val="28"/>
-        </w:rPr>
-        <w:t>nMOS</w:t>
-      </w:r>
-      <w:proofErr w:type="spellEnd"/>
-      <w:r>
-        <w:rPr>
-          <w:rFonts w:ascii="Times New Roman" w:hAnsi="Times New Roman" w:cs="Times New Roman"/>
-          <w:sz w:val="28"/>
-          <w:szCs w:val="28"/>
-        </w:rPr>
-        <w:t xml:space="preserve"> should be connected to ground and that of </w:t>
-      </w:r>
-      <w:proofErr w:type="spellStart"/>
-      <w:r>
-        <w:rPr>
-          <w:rFonts w:ascii="Times New Roman" w:hAnsi="Times New Roman" w:cs="Times New Roman"/>
-          <w:sz w:val="28"/>
-          <w:szCs w:val="28"/>
-        </w:rPr>
-        <w:t>pMOS</w:t>
-      </w:r>
-      <w:proofErr w:type="spellEnd"/>
-      <w:r>
-        <w:rPr>
-          <w:rFonts w:ascii="Times New Roman" w:hAnsi="Times New Roman" w:cs="Times New Roman"/>
-          <w:sz w:val="28"/>
-          <w:szCs w:val="28"/>
-        </w:rPr>
-        <w:t xml:space="preserve"> should be connected to high voltage, but for a standard MOSFET we have only three pins and this bulk pin is connected to the source pin inside the housing and hence can not be connected somewhere else. As learned from google, for making transmission gates ICs are used in which bulk of all </w:t>
-      </w:r>
-      <w:proofErr w:type="spellStart"/>
-      <w:r>
-        <w:rPr>
-          <w:rFonts w:ascii="Times New Roman" w:hAnsi="Times New Roman" w:cs="Times New Roman"/>
-          <w:sz w:val="28"/>
-          <w:szCs w:val="28"/>
-        </w:rPr>
-        <w:t>nMOS</w:t>
-      </w:r>
-      <w:proofErr w:type="spellEnd"/>
-      <w:r>
-        <w:rPr>
-          <w:rFonts w:ascii="Times New Roman" w:hAnsi="Times New Roman" w:cs="Times New Roman"/>
-          <w:sz w:val="28"/>
-          <w:szCs w:val="28"/>
-        </w:rPr>
-        <w:t xml:space="preserve"> </w:t>
-      </w:r>
-      <w:r>
-        <w:rPr>
-          <w:rFonts w:ascii="Times New Roman" w:hAnsi="Times New Roman" w:cs="Times New Roman"/>
-          <w:sz w:val="28"/>
-          <w:szCs w:val="28"/>
-        </w:rPr>
-        <w:t xml:space="preserve">transistors </w:t>
-      </w:r>
-      <w:r>
-        <w:rPr>
-          <w:rFonts w:ascii="Times New Roman" w:hAnsi="Times New Roman" w:cs="Times New Roman"/>
-          <w:sz w:val="28"/>
-          <w:szCs w:val="28"/>
-        </w:rPr>
-        <w:t xml:space="preserve">is connected to ground/ lowest voltage and bulk pin of all </w:t>
-      </w:r>
-      <w:proofErr w:type="spellStart"/>
-      <w:r>
-        <w:rPr>
-          <w:rFonts w:ascii="Times New Roman" w:hAnsi="Times New Roman" w:cs="Times New Roman"/>
-          <w:sz w:val="28"/>
-          <w:szCs w:val="28"/>
-        </w:rPr>
-        <w:t>pMOS</w:t>
-      </w:r>
-      <w:proofErr w:type="spellEnd"/>
-      <w:r>
-        <w:rPr>
-          <w:rFonts w:ascii="Times New Roman" w:hAnsi="Times New Roman" w:cs="Times New Roman"/>
-          <w:sz w:val="28"/>
-          <w:szCs w:val="28"/>
-        </w:rPr>
-        <w:t xml:space="preserve"> </w:t>
-      </w:r>
-      <w:r>
-        <w:rPr>
-          <w:rFonts w:ascii="Times New Roman" w:hAnsi="Times New Roman" w:cs="Times New Roman"/>
-          <w:sz w:val="28"/>
-          <w:szCs w:val="28"/>
-        </w:rPr>
-        <w:t xml:space="preserve">transistors </w:t>
-      </w:r>
-      <w:r>
-        <w:rPr>
-          <w:rFonts w:ascii="Times New Roman" w:hAnsi="Times New Roman" w:cs="Times New Roman"/>
-          <w:sz w:val="28"/>
-          <w:szCs w:val="28"/>
-        </w:rPr>
-        <w:t xml:space="preserve">is connected to VDD/ highest voltage. </w:t>
-      </w:r>
-    </w:p>
-    <w:p>
-      <w:pPr>
-        <w:jc w:val="both"/>
-        <w:rPr>
-          <w:rFonts w:ascii="Times New Roman" w:hAnsi="Times New Roman" w:cs="Times New Roman"/>
-          <w:sz w:val="28"/>
-          <w:szCs w:val="28"/>
-        </w:rPr>
-      </w:pPr>
-    </w:p>
-    <w:p>
-      <w:pPr>
-        <w:jc w:val="both"/>
-        <w:rPr>
-          <w:rFonts w:ascii="Times New Roman" w:hAnsi="Times New Roman" w:cs="Times New Roman"/>
-          <w:sz w:val="28"/>
-          <w:szCs w:val="28"/>
-        </w:rPr>
-      </w:pPr>
-    </w:p>
-    <w:p>
-      <w:pPr>
-        <w:jc w:val="both"/>
-        <w:rPr>
-          <w:rFonts w:ascii="Times New Roman" w:hAnsi="Times New Roman" w:cs="Times New Roman"/>
-          <w:sz w:val="28"/>
-          <w:szCs w:val="28"/>
-        </w:rPr>
-      </w:pPr>
-    </w:p>
-    <w:p>
-      <w:pPr>
-        <w:jc w:val="both"/>
-        <w:rPr>
-          <w:rFonts w:ascii="Times New Roman" w:hAnsi="Times New Roman" w:cs="Times New Roman"/>
-          <w:sz w:val="28"/>
-          <w:szCs w:val="28"/>
-        </w:rPr>
-      </w:pPr>
-    </w:p>
-    <w:p>
-      <w:pPr>
-        <w:jc w:val="both"/>
-        <w:rPr>
-          <w:rFonts w:ascii="Times New Roman" w:hAnsi="Times New Roman" w:cs="Times New Roman"/>
-          <w:sz w:val="28"/>
-          <w:szCs w:val="28"/>
-        </w:rPr>
-      </w:pPr>
+      </w:pPr>
+    </w:p>
+    <w:p>
+      <w:pPr>
+        <w:jc w:val="both"/>
+        <w:rPr>
+          <w:rFonts w:ascii="Times New Roman" w:hAnsi="Times New Roman" w:cs="Times New Roman"/>
+          <w:b/>
+          <w:bCs/>
+          <w:sz w:val="28"/>
+          <w:szCs w:val="28"/>
+        </w:rPr>
+      </w:pPr>
+      <w:r>
+        <w:rPr>
+          <w:rFonts w:ascii="Times New Roman" w:hAnsi="Times New Roman" w:cs="Times New Roman"/>
+          <w:b/>
+          <w:bCs/>
+          <w:sz w:val="28"/>
+          <w:szCs w:val="28"/>
+        </w:rPr>
+        <w:t>Update-1</w:t>
+      </w:r>
+    </w:p>
+    <w:p>
+      <w:pPr>
+        <w:jc w:val="both"/>
+        <w:rPr>
+          <w:rFonts w:ascii="Times New Roman" w:hAnsi="Times New Roman" w:cs="Times New Roman"/>
+          <w:sz w:val="28"/>
+          <w:szCs w:val="28"/>
+        </w:rPr>
+      </w:pPr>
+      <w:r>
+        <w:rPr>
+          <w:rFonts w:ascii="Times New Roman" w:hAnsi="Times New Roman" w:cs="Times New Roman"/>
+          <w:sz w:val="28"/>
+          <w:szCs w:val="28"/>
+        </w:rPr>
+        <w:t>Finally, learned to create symbol in LTSpice. Created a symbol for CMOS inverter to simplify the circuit. Now replaced the inverter inside transmission gate with the inverter symbol.</w:t>
+      </w:r>
+    </w:p>
+    <w:p>
+      <w:pPr>
+        <w:jc w:val="both"/>
+        <w:rPr>
+          <w:rFonts w:ascii="Times New Roman" w:hAnsi="Times New Roman" w:cs="Times New Roman"/>
+          <w:sz w:val="28"/>
+          <w:szCs w:val="28"/>
+        </w:rPr>
+      </w:pPr>
+      <w:r>
+        <w:rPr>
+          <w:rFonts w:ascii="Times New Roman" w:hAnsi="Times New Roman" w:cs="Times New Roman"/>
+          <w:sz w:val="28"/>
+          <w:szCs w:val="28"/>
+        </w:rPr>
+        <w:drawing>
+          <wp:inline distT="0" distB="0" distL="0" distR="0" wp14:anchorId="60B571E1" wp14:editId="2DE6ABCB">
+            <wp:extent cx="1850784" cy="1936750"/>
+            <wp:effectExtent l="0" t="0" r="0" b="6350"/>
+            <wp:docPr id="307145028" name="Picture 1"/>
+            <wp:cNvGraphicFramePr>
+              <a:graphicFrameLocks xmlns:a="http://schemas.openxmlformats.org/drawingml/2006/main" noChangeAspect="1"/>
+            </wp:cNvGraphicFramePr>
+            <a:graphic xmlns:a="http://schemas.openxmlformats.org/drawingml/2006/main">
+              <a:graphicData uri="http://schemas.openxmlformats.org/drawingml/2006/picture">
+                <pic:pic xmlns:pic="http://schemas.openxmlformats.org/drawingml/2006/picture">
+                  <pic:nvPicPr>
+                    <pic:cNvPr id="307145028" name=""/>
+                    <pic:cNvPicPr/>
+                  </pic:nvPicPr>
+                  <pic:blipFill>
+                    <a:blip r:embed="rId7"/>
+                    <a:stretch>
+                      <a:fillRect/>
+                    </a:stretch>
+                  </pic:blipFill>
+                  <pic:spPr>
+                    <a:xfrm>
+                      <a:off x="0" y="0"/>
+                      <a:ext cx="1858262" cy="1944575"/>
+                    </a:xfrm>
+                    <a:prstGeom prst="rect">
+                      <a:avLst/>
+                    </a:prstGeom>
+                  </pic:spPr>
+                </pic:pic>
+              </a:graphicData>
+            </a:graphic>
+          </wp:inline>
+        </w:drawing>
+      </w:r>
+      <w:r>
+        <w:rPr>
+          <w:rFonts w:ascii="Times New Roman" w:hAnsi="Times New Roman" w:cs="Times New Roman"/>
+          <w:sz w:val="28"/>
+          <w:szCs w:val="28"/>
+        </w:rPr>
+        <w:t xml:space="preserve">  </w:t>
+      </w:r>
+      <w:r>
+        <w:rPr>
+          <w:rFonts w:ascii="Times New Roman" w:hAnsi="Times New Roman" w:cs="Times New Roman"/>
+          <w:sz w:val="28"/>
+          <w:szCs w:val="28"/>
+        </w:rPr>
+        <w:drawing>
+          <wp:inline distT="0" distB="0" distL="0" distR="0" wp14:anchorId="3E14BA02" wp14:editId="1C7CB111">
+            <wp:extent cx="2692400" cy="1926540"/>
+            <wp:effectExtent l="0" t="0" r="0" b="0"/>
+            <wp:docPr id="409988932" name="Picture 1"/>
+            <wp:cNvGraphicFramePr>
+              <a:graphicFrameLocks xmlns:a="http://schemas.openxmlformats.org/drawingml/2006/main" noChangeAspect="1"/>
+            </wp:cNvGraphicFramePr>
+            <a:graphic xmlns:a="http://schemas.openxmlformats.org/drawingml/2006/main">
+              <a:graphicData uri="http://schemas.openxmlformats.org/drawingml/2006/picture">
+                <pic:pic xmlns:pic="http://schemas.openxmlformats.org/drawingml/2006/picture">
+                  <pic:nvPicPr>
+                    <pic:cNvPr id="409988932" name=""/>
+                    <pic:cNvPicPr/>
+                  </pic:nvPicPr>
+                  <pic:blipFill>
+                    <a:blip r:embed="rId8"/>
+                    <a:stretch>
+                      <a:fillRect/>
+                    </a:stretch>
+                  </pic:blipFill>
+                  <pic:spPr>
+                    <a:xfrm>
+                      <a:off x="0" y="0"/>
+                      <a:ext cx="2707362" cy="1937246"/>
+                    </a:xfrm>
+                    <a:prstGeom prst="rect">
+                      <a:avLst/>
+                    </a:prstGeom>
+                  </pic:spPr>
+                </pic:pic>
+              </a:graphicData>
+            </a:graphic>
+          </wp:inline>
+        </w:drawing>
+      </w:r>
+    </w:p>
+    <w:p>
+      <w:pPr>
+        <w:jc w:val="both"/>
+        <w:rPr>
+          <w:rFonts w:ascii="Times New Roman" w:hAnsi="Times New Roman" w:cs="Times New Roman"/>
+          <w:sz w:val="28"/>
+          <w:szCs w:val="28"/>
+        </w:rPr>
+      </w:pPr>
+      <w:r>
+        <w:rPr>
+          <w:rFonts w:ascii="Times New Roman" w:hAnsi="Times New Roman" w:cs="Times New Roman"/>
+          <w:sz w:val="28"/>
+          <w:szCs w:val="28"/>
+        </w:rPr>
+        <w:lastRenderedPageBreak/>
+        <w:t xml:space="preserve">Above, is the circuit for CMOS inverter and symbol for the corresponding circuit. </w:t>
+      </w:r>
+    </w:p>
+    <w:p>
+      <w:pPr>
+        <w:jc w:val="both"/>
+        <w:rPr>
+          <w:rFonts w:ascii="Times New Roman" w:hAnsi="Times New Roman" w:cs="Times New Roman"/>
+          <w:sz w:val="28"/>
+          <w:szCs w:val="28"/>
+        </w:rPr>
+      </w:pPr>
+      <w:r>
+        <w:rPr>
+          <w:rFonts w:ascii="Times New Roman" w:hAnsi="Times New Roman" w:cs="Times New Roman"/>
+          <w:sz w:val="28"/>
+          <w:szCs w:val="28"/>
+        </w:rPr>
+        <w:t>Updated Transmission gate circuit</w:t>
+      </w:r>
+    </w:p>
+    <w:p>
+      <w:pPr>
+        <w:jc w:val="both"/>
+        <w:rPr>
+          <w:rFonts w:ascii="Times New Roman" w:hAnsi="Times New Roman" w:cs="Times New Roman"/>
+          <w:sz w:val="28"/>
+          <w:szCs w:val="28"/>
+        </w:rPr>
+      </w:pPr>
+      <w:r>
+        <w:rPr>
+          <w:rFonts w:ascii="Times New Roman" w:hAnsi="Times New Roman" w:cs="Times New Roman"/>
+          <w:sz w:val="28"/>
+          <w:szCs w:val="28"/>
+        </w:rPr>
+        <w:drawing>
+          <wp:inline distT="0" distB="0" distL="0" distR="0" wp14:anchorId="5BFACDA1" wp14:editId="7175745D">
+            <wp:extent cx="5731510" cy="3764915"/>
+            <wp:effectExtent l="0" t="0" r="2540" b="6985"/>
+            <wp:docPr id="84720092" name="Picture 1"/>
+            <wp:cNvGraphicFramePr>
+              <a:graphicFrameLocks xmlns:a="http://schemas.openxmlformats.org/drawingml/2006/main" noChangeAspect="1"/>
+            </wp:cNvGraphicFramePr>
+            <a:graphic xmlns:a="http://schemas.openxmlformats.org/drawingml/2006/main">
+              <a:graphicData uri="http://schemas.openxmlformats.org/drawingml/2006/picture">
+                <pic:pic xmlns:pic="http://schemas.openxmlformats.org/drawingml/2006/picture">
+                  <pic:nvPicPr>
+                    <pic:cNvPr id="84720092" name=""/>
+                    <pic:cNvPicPr/>
+                  </pic:nvPicPr>
+                  <pic:blipFill>
+                    <a:blip r:embed="rId9"/>
+                    <a:stretch>
+                      <a:fillRect/>
+                    </a:stretch>
+                  </pic:blipFill>
+                  <pic:spPr>
+                    <a:xfrm>
+                      <a:off x="0" y="0"/>
+                      <a:ext cx="5731510" cy="3764915"/>
+                    </a:xfrm>
+                    <a:prstGeom prst="rect">
+                      <a:avLst/>
+                    </a:prstGeom>
+                  </pic:spPr>
+                </pic:pic>
+              </a:graphicData>
+            </a:graphic>
+          </wp:inline>
+        </w:drawing>
+      </w:r>
+    </w:p>
+    <w:p>
+      <w:pPr>
+        <w:jc w:val="both"/>
+        <w:rPr>
+          <w:rFonts w:ascii="Times New Roman" w:hAnsi="Times New Roman" w:cs="Times New Roman"/>
+          <w:sz w:val="28"/>
+          <w:szCs w:val="28"/>
+        </w:rPr>
+      </w:pPr>
+      <w:r>
+        <w:rPr>
+          <w:rFonts w:ascii="Times New Roman" w:hAnsi="Times New Roman" w:cs="Times New Roman"/>
+          <w:sz w:val="28"/>
+          <w:szCs w:val="28"/>
+        </w:rPr>
+        <w:t>And of course output remains the same.</w:t>
+      </w:r>
+    </w:p>
+    <w:p>
+      <w:pPr>
+        <w:jc w:val="both"/>
+        <w:rPr>
+          <w:rFonts w:ascii="Times New Roman" w:hAnsi="Times New Roman" w:cs="Times New Roman"/>
+          <w:sz w:val="28"/>
+          <w:szCs w:val="28"/>
+        </w:rPr>
+      </w:pPr>
+      <w:r>
+        <w:rPr>
+          <w:noProof/>
+        </w:rPr>
+        <w:drawing>
+          <wp:inline distT="0" distB="0" distL="0" distR="0" wp14:anchorId="7E67E77F" wp14:editId="3E9B0325">
+            <wp:extent cx="5731510" cy="2540000"/>
+            <wp:effectExtent l="0" t="0" r="2540" b="0"/>
+            <wp:docPr id="419383176" name="Picture 1"/>
+            <wp:cNvGraphicFramePr>
+              <a:graphicFrameLocks xmlns:a="http://schemas.openxmlformats.org/drawingml/2006/main" noChangeAspect="1"/>
+            </wp:cNvGraphicFramePr>
+            <a:graphic xmlns:a="http://schemas.openxmlformats.org/drawingml/2006/main">
+              <a:graphicData uri="http://schemas.openxmlformats.org/drawingml/2006/picture">
+                <pic:pic xmlns:pic="http://schemas.openxmlformats.org/drawingml/2006/picture">
+                  <pic:nvPicPr>
+                    <pic:cNvPr id="419383176" name=""/>
+                    <pic:cNvPicPr/>
+                  </pic:nvPicPr>
+                  <pic:blipFill>
+                    <a:blip r:embed="rId10"/>
+                    <a:stretch>
+                      <a:fillRect/>
+                    </a:stretch>
+                  </pic:blipFill>
+                  <pic:spPr>
+                    <a:xfrm>
+                      <a:off x="0" y="0"/>
+                      <a:ext cx="5731510" cy="2540000"/>
+                    </a:xfrm>
+                    <a:prstGeom prst="rect">
+                      <a:avLst/>
+                    </a:prstGeom>
+                  </pic:spPr>
+                </pic:pic>
+              </a:graphicData>
+            </a:graphic>
+          </wp:inline>
+        </w:drawing>
+      </w:r>
     </w:p>
     <w:p>
       <w:pPr>

</xml_diff>

<commit_message>
Symbol for transmission gate
</commit_message>
<xml_diff>
--- a/Transmission Gate.docx
+++ b/Transmission Gate.docx
@@ -1035,6 +1035,7 @@
       <w:r>
         <w:rPr>
           <w:rFonts w:ascii="Times New Roman" w:hAnsi="Times New Roman" w:cs="Times New Roman"/>
+          <w:noProof/>
           <w:sz w:val="28"/>
           <w:szCs w:val="28"/>
         </w:rPr>
@@ -1085,6 +1086,7 @@
       <w:r>
         <w:rPr>
           <w:rFonts w:ascii="Times New Roman" w:hAnsi="Times New Roman" w:cs="Times New Roman"/>
+          <w:noProof/>
           <w:sz w:val="28"/>
           <w:szCs w:val="28"/>
         </w:rPr>
@@ -1174,6 +1176,7 @@
       <w:r>
         <w:rPr>
           <w:rFonts w:ascii="Times New Roman" w:hAnsi="Times New Roman" w:cs="Times New Roman"/>
+          <w:noProof/>
           <w:sz w:val="28"/>
           <w:szCs w:val="28"/>
         </w:rPr>
@@ -1291,6 +1294,402 @@
           <w:szCs w:val="28"/>
         </w:rPr>
       </w:pPr>
+    </w:p>
+    <w:p>
+      <w:pPr>
+        <w:jc w:val="both"/>
+        <w:rPr>
+          <w:rFonts w:ascii="Times New Roman" w:hAnsi="Times New Roman" w:cs="Times New Roman"/>
+          <w:sz w:val="28"/>
+          <w:szCs w:val="28"/>
+        </w:rPr>
+      </w:pPr>
+    </w:p>
+    <w:p>
+      <w:pPr>
+        <w:jc w:val="both"/>
+        <w:rPr>
+          <w:rFonts w:ascii="Times New Roman" w:hAnsi="Times New Roman" w:cs="Times New Roman"/>
+          <w:sz w:val="28"/>
+          <w:szCs w:val="28"/>
+        </w:rPr>
+      </w:pPr>
+    </w:p>
+    <w:p>
+      <w:pPr>
+        <w:jc w:val="both"/>
+        <w:rPr>
+          <w:rFonts w:ascii="Times New Roman" w:hAnsi="Times New Roman" w:cs="Times New Roman"/>
+          <w:sz w:val="28"/>
+          <w:szCs w:val="28"/>
+        </w:rPr>
+      </w:pPr>
+    </w:p>
+    <w:p>
+      <w:pPr>
+        <w:jc w:val="both"/>
+        <w:rPr>
+          <w:rFonts w:ascii="Times New Roman" w:hAnsi="Times New Roman" w:cs="Times New Roman"/>
+          <w:b/>
+          <w:bCs/>
+          <w:sz w:val="28"/>
+          <w:szCs w:val="28"/>
+        </w:rPr>
+      </w:pPr>
+      <w:r>
+        <w:rPr>
+          <w:rFonts w:ascii="Times New Roman" w:hAnsi="Times New Roman" w:cs="Times New Roman"/>
+          <w:b/>
+          <w:bCs/>
+          <w:sz w:val="28"/>
+          <w:szCs w:val="28"/>
+        </w:rPr>
+        <w:lastRenderedPageBreak/>
+        <w:t>Update-2</w:t>
+      </w:r>
+    </w:p>
+    <w:p>
+      <w:pPr>
+        <w:jc w:val="both"/>
+        <w:rPr>
+          <w:rFonts w:ascii="Times New Roman" w:hAnsi="Times New Roman" w:cs="Times New Roman"/>
+          <w:sz w:val="28"/>
+          <w:szCs w:val="28"/>
+        </w:rPr>
+      </w:pPr>
+      <w:r>
+        <w:rPr>
+          <w:rFonts w:ascii="Times New Roman" w:hAnsi="Times New Roman" w:cs="Times New Roman"/>
+          <w:sz w:val="28"/>
+          <w:szCs w:val="28"/>
+        </w:rPr>
+        <w:t xml:space="preserve">Previously, we designed symbol for inverter and used it to develop transmission gate. Today, I developed symbol for transmission to use portably use it in other circuits. </w:t>
+      </w:r>
+    </w:p>
+    <w:p>
+      <w:pPr>
+        <w:jc w:val="both"/>
+        <w:rPr>
+          <w:rFonts w:ascii="Times New Roman" w:hAnsi="Times New Roman" w:cs="Times New Roman"/>
+          <w:sz w:val="28"/>
+          <w:szCs w:val="28"/>
+        </w:rPr>
+      </w:pPr>
+      <w:r>
+        <w:rPr>
+          <w:rFonts w:ascii="Times New Roman" w:hAnsi="Times New Roman" w:cs="Times New Roman"/>
+          <w:sz w:val="28"/>
+          <w:szCs w:val="28"/>
+        </w:rPr>
+        <w:t>Schematic for symbol of transmission gate.</w:t>
+      </w:r>
+    </w:p>
+    <w:p>
+      <w:pPr>
+        <w:jc w:val="both"/>
+        <w:rPr>
+          <w:rFonts w:ascii="Times New Roman" w:hAnsi="Times New Roman" w:cs="Times New Roman"/>
+          <w:sz w:val="28"/>
+          <w:szCs w:val="28"/>
+        </w:rPr>
+      </w:pPr>
+      <w:r>
+        <w:rPr>
+          <w:rFonts w:ascii="Times New Roman" w:hAnsi="Times New Roman" w:cs="Times New Roman"/>
+          <w:sz w:val="28"/>
+          <w:szCs w:val="28"/>
+        </w:rPr>
+        <w:drawing>
+          <wp:inline distT="0" distB="0" distL="0" distR="0" wp14:anchorId="1882996E" wp14:editId="26FEB822">
+            <wp:extent cx="3892581" cy="3937000"/>
+            <wp:effectExtent l="0" t="0" r="0" b="6350"/>
+            <wp:docPr id="1433096295" name="Picture 1"/>
+            <wp:cNvGraphicFramePr>
+              <a:graphicFrameLocks xmlns:a="http://schemas.openxmlformats.org/drawingml/2006/main" noChangeAspect="1"/>
+            </wp:cNvGraphicFramePr>
+            <a:graphic xmlns:a="http://schemas.openxmlformats.org/drawingml/2006/main">
+              <a:graphicData uri="http://schemas.openxmlformats.org/drawingml/2006/picture">
+                <pic:pic xmlns:pic="http://schemas.openxmlformats.org/drawingml/2006/picture">
+                  <pic:nvPicPr>
+                    <pic:cNvPr id="1433096295" name=""/>
+                    <pic:cNvPicPr/>
+                  </pic:nvPicPr>
+                  <pic:blipFill>
+                    <a:blip r:embed="rId11"/>
+                    <a:stretch>
+                      <a:fillRect/>
+                    </a:stretch>
+                  </pic:blipFill>
+                  <pic:spPr>
+                    <a:xfrm>
+                      <a:off x="0" y="0"/>
+                      <a:ext cx="3898501" cy="3942988"/>
+                    </a:xfrm>
+                    <a:prstGeom prst="rect">
+                      <a:avLst/>
+                    </a:prstGeom>
+                  </pic:spPr>
+                </pic:pic>
+              </a:graphicData>
+            </a:graphic>
+          </wp:inline>
+        </w:drawing>
+      </w:r>
+    </w:p>
+    <w:p>
+      <w:pPr>
+        <w:jc w:val="both"/>
+        <w:rPr>
+          <w:rFonts w:ascii="Times New Roman" w:hAnsi="Times New Roman" w:cs="Times New Roman"/>
+          <w:sz w:val="28"/>
+          <w:szCs w:val="28"/>
+        </w:rPr>
+      </w:pPr>
+      <w:r>
+        <w:rPr>
+          <w:rFonts w:ascii="Times New Roman" w:hAnsi="Times New Roman" w:cs="Times New Roman"/>
+          <w:sz w:val="28"/>
+          <w:szCs w:val="28"/>
+        </w:rPr>
+        <w:t>Symbol for transmission gate</w:t>
+      </w:r>
+    </w:p>
+    <w:p>
+      <w:pPr>
+        <w:jc w:val="both"/>
+        <w:rPr>
+          <w:rFonts w:ascii="Times New Roman" w:hAnsi="Times New Roman" w:cs="Times New Roman"/>
+          <w:sz w:val="28"/>
+          <w:szCs w:val="28"/>
+        </w:rPr>
+      </w:pPr>
+      <w:r>
+        <w:rPr>
+          <w:rFonts w:ascii="Times New Roman" w:hAnsi="Times New Roman" w:cs="Times New Roman"/>
+          <w:sz w:val="28"/>
+          <w:szCs w:val="28"/>
+        </w:rPr>
+        <w:drawing>
+          <wp:inline distT="0" distB="0" distL="0" distR="0" wp14:anchorId="5593B479" wp14:editId="39D7E77C">
+            <wp:extent cx="2825750" cy="2637909"/>
+            <wp:effectExtent l="0" t="0" r="0" b="0"/>
+            <wp:docPr id="1988469691" name="Picture 1"/>
+            <wp:cNvGraphicFramePr>
+              <a:graphicFrameLocks xmlns:a="http://schemas.openxmlformats.org/drawingml/2006/main" noChangeAspect="1"/>
+            </wp:cNvGraphicFramePr>
+            <a:graphic xmlns:a="http://schemas.openxmlformats.org/drawingml/2006/main">
+              <a:graphicData uri="http://schemas.openxmlformats.org/drawingml/2006/picture">
+                <pic:pic xmlns:pic="http://schemas.openxmlformats.org/drawingml/2006/picture">
+                  <pic:nvPicPr>
+                    <pic:cNvPr id="1988469691" name=""/>
+                    <pic:cNvPicPr/>
+                  </pic:nvPicPr>
+                  <pic:blipFill>
+                    <a:blip r:embed="rId12"/>
+                    <a:stretch>
+                      <a:fillRect/>
+                    </a:stretch>
+                  </pic:blipFill>
+                  <pic:spPr>
+                    <a:xfrm>
+                      <a:off x="0" y="0"/>
+                      <a:ext cx="2833812" cy="2645435"/>
+                    </a:xfrm>
+                    <a:prstGeom prst="rect">
+                      <a:avLst/>
+                    </a:prstGeom>
+                  </pic:spPr>
+                </pic:pic>
+              </a:graphicData>
+            </a:graphic>
+          </wp:inline>
+        </w:drawing>
+      </w:r>
+    </w:p>
+    <w:p>
+      <w:pPr>
+        <w:jc w:val="both"/>
+        <w:rPr>
+          <w:rFonts w:ascii="Times New Roman" w:hAnsi="Times New Roman" w:cs="Times New Roman"/>
+          <w:sz w:val="28"/>
+          <w:szCs w:val="28"/>
+        </w:rPr>
+      </w:pPr>
+      <w:r>
+        <w:rPr>
+          <w:rFonts w:ascii="Times New Roman" w:hAnsi="Times New Roman" w:cs="Times New Roman"/>
+          <w:sz w:val="28"/>
+          <w:szCs w:val="28"/>
+        </w:rPr>
+        <w:lastRenderedPageBreak/>
+        <w:t xml:space="preserve">This symbol is a bit different from what I saw on google. On google, it has inputs pins, as a, b, ctrl and ~ctrl but in schematic behind this symbol ~ctrl is already connected and I have added pins for vdd and vgnd. </w:t>
+      </w:r>
+    </w:p>
+    <w:p>
+      <w:pPr>
+        <w:jc w:val="both"/>
+        <w:rPr>
+          <w:rFonts w:ascii="Times New Roman" w:hAnsi="Times New Roman" w:cs="Times New Roman"/>
+          <w:sz w:val="28"/>
+          <w:szCs w:val="28"/>
+        </w:rPr>
+      </w:pPr>
+      <w:r>
+        <w:rPr>
+          <w:rFonts w:ascii="Times New Roman" w:hAnsi="Times New Roman" w:cs="Times New Roman"/>
+          <w:sz w:val="28"/>
+          <w:szCs w:val="28"/>
+        </w:rPr>
+        <w:t>Testing the symbol</w:t>
+      </w:r>
+    </w:p>
+    <w:p>
+      <w:pPr>
+        <w:jc w:val="both"/>
+        <w:rPr>
+          <w:rFonts w:ascii="Times New Roman" w:hAnsi="Times New Roman" w:cs="Times New Roman"/>
+          <w:sz w:val="28"/>
+          <w:szCs w:val="28"/>
+        </w:rPr>
+      </w:pPr>
+      <w:r>
+        <w:rPr>
+          <w:rFonts w:ascii="Times New Roman" w:hAnsi="Times New Roman" w:cs="Times New Roman"/>
+          <w:sz w:val="28"/>
+          <w:szCs w:val="28"/>
+        </w:rPr>
+        <w:drawing>
+          <wp:inline distT="0" distB="0" distL="0" distR="0" wp14:anchorId="410ED636" wp14:editId="2A16215A">
+            <wp:extent cx="5731510" cy="2603500"/>
+            <wp:effectExtent l="0" t="0" r="2540" b="6350"/>
+            <wp:docPr id="1119850848" name="Picture 1"/>
+            <wp:cNvGraphicFramePr>
+              <a:graphicFrameLocks xmlns:a="http://schemas.openxmlformats.org/drawingml/2006/main" noChangeAspect="1"/>
+            </wp:cNvGraphicFramePr>
+            <a:graphic xmlns:a="http://schemas.openxmlformats.org/drawingml/2006/main">
+              <a:graphicData uri="http://schemas.openxmlformats.org/drawingml/2006/picture">
+                <pic:pic xmlns:pic="http://schemas.openxmlformats.org/drawingml/2006/picture">
+                  <pic:nvPicPr>
+                    <pic:cNvPr id="1119850848" name=""/>
+                    <pic:cNvPicPr/>
+                  </pic:nvPicPr>
+                  <pic:blipFill>
+                    <a:blip r:embed="rId13"/>
+                    <a:stretch>
+                      <a:fillRect/>
+                    </a:stretch>
+                  </pic:blipFill>
+                  <pic:spPr>
+                    <a:xfrm>
+                      <a:off x="0" y="0"/>
+                      <a:ext cx="5731510" cy="2603500"/>
+                    </a:xfrm>
+                    <a:prstGeom prst="rect">
+                      <a:avLst/>
+                    </a:prstGeom>
+                  </pic:spPr>
+                </pic:pic>
+              </a:graphicData>
+            </a:graphic>
+          </wp:inline>
+        </w:drawing>
+      </w:r>
+    </w:p>
+    <w:p>
+      <w:pPr>
+        <w:jc w:val="both"/>
+        <w:rPr>
+          <w:rFonts w:ascii="Times New Roman" w:hAnsi="Times New Roman" w:cs="Times New Roman"/>
+          <w:sz w:val="28"/>
+          <w:szCs w:val="28"/>
+        </w:rPr>
+      </w:pPr>
+    </w:p>
+    <w:p>
+      <w:pPr>
+        <w:jc w:val="both"/>
+        <w:rPr>
+          <w:rFonts w:ascii="Times New Roman" w:hAnsi="Times New Roman" w:cs="Times New Roman"/>
+          <w:sz w:val="28"/>
+          <w:szCs w:val="28"/>
+        </w:rPr>
+      </w:pPr>
+      <w:r>
+        <w:rPr>
+          <w:rFonts w:ascii="Times New Roman" w:hAnsi="Times New Roman" w:cs="Times New Roman"/>
+          <w:sz w:val="28"/>
+          <w:szCs w:val="28"/>
+        </w:rPr>
+        <w:t>Simulation Results:</w:t>
+      </w:r>
+    </w:p>
+    <w:p>
+      <w:pPr>
+        <w:jc w:val="both"/>
+        <w:rPr>
+          <w:rFonts w:ascii="Times New Roman" w:hAnsi="Times New Roman" w:cs="Times New Roman"/>
+          <w:sz w:val="28"/>
+          <w:szCs w:val="28"/>
+        </w:rPr>
+      </w:pPr>
+      <w:r>
+        <w:rPr>
+          <w:noProof/>
+        </w:rPr>
+        <w:drawing>
+          <wp:inline distT="0" distB="0" distL="0" distR="0" wp14:anchorId="1985F2EC" wp14:editId="49F490A5">
+            <wp:extent cx="5731510" cy="2540000"/>
+            <wp:effectExtent l="0" t="0" r="2540" b="0"/>
+            <wp:docPr id="98159822" name="Picture 1"/>
+            <wp:cNvGraphicFramePr>
+              <a:graphicFrameLocks xmlns:a="http://schemas.openxmlformats.org/drawingml/2006/main" noChangeAspect="1"/>
+            </wp:cNvGraphicFramePr>
+            <a:graphic xmlns:a="http://schemas.openxmlformats.org/drawingml/2006/main">
+              <a:graphicData uri="http://schemas.openxmlformats.org/drawingml/2006/picture">
+                <pic:pic xmlns:pic="http://schemas.openxmlformats.org/drawingml/2006/picture">
+                  <pic:nvPicPr>
+                    <pic:cNvPr id="98159822" name=""/>
+                    <pic:cNvPicPr/>
+                  </pic:nvPicPr>
+                  <pic:blipFill>
+                    <a:blip r:embed="rId14"/>
+                    <a:stretch>
+                      <a:fillRect/>
+                    </a:stretch>
+                  </pic:blipFill>
+                  <pic:spPr>
+                    <a:xfrm>
+                      <a:off x="0" y="0"/>
+                      <a:ext cx="5731510" cy="2540000"/>
+                    </a:xfrm>
+                    <a:prstGeom prst="rect">
+                      <a:avLst/>
+                    </a:prstGeom>
+                  </pic:spPr>
+                </pic:pic>
+              </a:graphicData>
+            </a:graphic>
+          </wp:inline>
+        </w:drawing>
+      </w:r>
+    </w:p>
+    <w:p>
+      <w:pPr>
+        <w:jc w:val="both"/>
+        <w:rPr>
+          <w:rFonts w:ascii="Times New Roman" w:hAnsi="Times New Roman" w:cs="Times New Roman"/>
+          <w:sz w:val="28"/>
+          <w:szCs w:val="28"/>
+        </w:rPr>
+      </w:pPr>
+      <w:r>
+        <w:rPr>
+          <w:rFonts w:ascii="Times New Roman" w:hAnsi="Times New Roman" w:cs="Times New Roman"/>
+          <w:sz w:val="28"/>
+          <w:szCs w:val="28"/>
+        </w:rPr>
+        <w:t>For simulation the output of the transmission has been pulled down using a 10 Mega Ohm resistor.</w:t>
+      </w:r>
     </w:p>
     <w:p>
       <w:pPr>

</xml_diff>

<commit_message>
Mux using Transmission Gate
</commit_message>
<xml_diff>
--- a/Transmission Gate.docx
+++ b/Transmission Gate.docx
@@ -61,7 +61,43 @@
           <w:sz w:val="28"/>
           <w:szCs w:val="28"/>
         </w:rPr>
-        <w:t>Since, nMOS acts as a perfect switch for logic 0 and pMOS acts as a perfect switch for logic 1. A transmission gate contains a combination of both.</w:t>
+        <w:t xml:space="preserve">Since, </w:t>
+      </w:r>
+      <w:proofErr w:type="spellStart"/>
+      <w:r>
+        <w:rPr>
+          <w:rFonts w:ascii="Times New Roman" w:hAnsi="Times New Roman" w:cs="Times New Roman"/>
+          <w:sz w:val="28"/>
+          <w:szCs w:val="28"/>
+        </w:rPr>
+        <w:t>nMOS</w:t>
+      </w:r>
+      <w:proofErr w:type="spellEnd"/>
+      <w:r>
+        <w:rPr>
+          <w:rFonts w:ascii="Times New Roman" w:hAnsi="Times New Roman" w:cs="Times New Roman"/>
+          <w:sz w:val="28"/>
+          <w:szCs w:val="28"/>
+        </w:rPr>
+        <w:t xml:space="preserve"> acts as a perfect switch for logic 0 and </w:t>
+      </w:r>
+      <w:proofErr w:type="spellStart"/>
+      <w:r>
+        <w:rPr>
+          <w:rFonts w:ascii="Times New Roman" w:hAnsi="Times New Roman" w:cs="Times New Roman"/>
+          <w:sz w:val="28"/>
+          <w:szCs w:val="28"/>
+        </w:rPr>
+        <w:t>pMOS</w:t>
+      </w:r>
+      <w:proofErr w:type="spellEnd"/>
+      <w:r>
+        <w:rPr>
+          <w:rFonts w:ascii="Times New Roman" w:hAnsi="Times New Roman" w:cs="Times New Roman"/>
+          <w:sz w:val="28"/>
+          <w:szCs w:val="28"/>
+        </w:rPr>
+        <w:t xml:space="preserve"> acts as a perfect switch for logic 1. A transmission gate contains a combination of both.</w:t>
       </w:r>
       <w:r>
         <w:rPr>
@@ -210,7 +246,115 @@
           <w:sz w:val="28"/>
           <w:szCs w:val="28"/>
         </w:rPr>
-        <w:t>When logic 1 is applied to control signal, nMOS turns ON and due to inverter connected to pMOS, pMOS receives logic 0 and it also turns on. If source is connected to logic 0 then nMOS acts as perfect switch and if source is connected to logic 1 then pMOS acts as a perfect switch and signal is transferred from source to drain without degradation. When logic 0 is applied to control signal, both the transistors turns off leaving the output unconnected from the input. This creating the state of high impedance (Z).</w:t>
+        <w:t xml:space="preserve">When logic 1 is applied to control signal, </w:t>
+      </w:r>
+      <w:proofErr w:type="spellStart"/>
+      <w:r>
+        <w:rPr>
+          <w:rFonts w:ascii="Times New Roman" w:hAnsi="Times New Roman" w:cs="Times New Roman"/>
+          <w:sz w:val="28"/>
+          <w:szCs w:val="28"/>
+        </w:rPr>
+        <w:t>nMOS</w:t>
+      </w:r>
+      <w:proofErr w:type="spellEnd"/>
+      <w:r>
+        <w:rPr>
+          <w:rFonts w:ascii="Times New Roman" w:hAnsi="Times New Roman" w:cs="Times New Roman"/>
+          <w:sz w:val="28"/>
+          <w:szCs w:val="28"/>
+        </w:rPr>
+        <w:t xml:space="preserve"> turns ON and due to inverter connected to </w:t>
+      </w:r>
+      <w:proofErr w:type="spellStart"/>
+      <w:r>
+        <w:rPr>
+          <w:rFonts w:ascii="Times New Roman" w:hAnsi="Times New Roman" w:cs="Times New Roman"/>
+          <w:sz w:val="28"/>
+          <w:szCs w:val="28"/>
+        </w:rPr>
+        <w:t>pMOS</w:t>
+      </w:r>
+      <w:proofErr w:type="spellEnd"/>
+      <w:r>
+        <w:rPr>
+          <w:rFonts w:ascii="Times New Roman" w:hAnsi="Times New Roman" w:cs="Times New Roman"/>
+          <w:sz w:val="28"/>
+          <w:szCs w:val="28"/>
+        </w:rPr>
+        <w:t xml:space="preserve">, </w:t>
+      </w:r>
+      <w:proofErr w:type="spellStart"/>
+      <w:r>
+        <w:rPr>
+          <w:rFonts w:ascii="Times New Roman" w:hAnsi="Times New Roman" w:cs="Times New Roman"/>
+          <w:sz w:val="28"/>
+          <w:szCs w:val="28"/>
+        </w:rPr>
+        <w:t>pMOS</w:t>
+      </w:r>
+      <w:proofErr w:type="spellEnd"/>
+      <w:r>
+        <w:rPr>
+          <w:rFonts w:ascii="Times New Roman" w:hAnsi="Times New Roman" w:cs="Times New Roman"/>
+          <w:sz w:val="28"/>
+          <w:szCs w:val="28"/>
+        </w:rPr>
+        <w:t xml:space="preserve"> receives logic 0 and it also turns on. If source is connected to logic 0 then </w:t>
+      </w:r>
+      <w:proofErr w:type="spellStart"/>
+      <w:r>
+        <w:rPr>
+          <w:rFonts w:ascii="Times New Roman" w:hAnsi="Times New Roman" w:cs="Times New Roman"/>
+          <w:sz w:val="28"/>
+          <w:szCs w:val="28"/>
+        </w:rPr>
+        <w:t>nMOS</w:t>
+      </w:r>
+      <w:proofErr w:type="spellEnd"/>
+      <w:r>
+        <w:rPr>
+          <w:rFonts w:ascii="Times New Roman" w:hAnsi="Times New Roman" w:cs="Times New Roman"/>
+          <w:sz w:val="28"/>
+          <w:szCs w:val="28"/>
+        </w:rPr>
+        <w:t xml:space="preserve"> acts as perfect switch and if source is connected to logic 1 then </w:t>
+      </w:r>
+      <w:proofErr w:type="spellStart"/>
+      <w:r>
+        <w:rPr>
+          <w:rFonts w:ascii="Times New Roman" w:hAnsi="Times New Roman" w:cs="Times New Roman"/>
+          <w:sz w:val="28"/>
+          <w:szCs w:val="28"/>
+        </w:rPr>
+        <w:t>pMOS</w:t>
+      </w:r>
+      <w:proofErr w:type="spellEnd"/>
+      <w:r>
+        <w:rPr>
+          <w:rFonts w:ascii="Times New Roman" w:hAnsi="Times New Roman" w:cs="Times New Roman"/>
+          <w:sz w:val="28"/>
+          <w:szCs w:val="28"/>
+        </w:rPr>
+        <w:t xml:space="preserve"> acts as a perfect switch and signal is transferred from source to drain without degradation. When logic 0 is applied to control signal, both the transistors </w:t>
+      </w:r>
+      <w:proofErr w:type="gramStart"/>
+      <w:r>
+        <w:rPr>
+          <w:rFonts w:ascii="Times New Roman" w:hAnsi="Times New Roman" w:cs="Times New Roman"/>
+          <w:sz w:val="28"/>
+          <w:szCs w:val="28"/>
+        </w:rPr>
+        <w:t>turns</w:t>
+      </w:r>
+      <w:proofErr w:type="gramEnd"/>
+      <w:r>
+        <w:rPr>
+          <w:rFonts w:ascii="Times New Roman" w:hAnsi="Times New Roman" w:cs="Times New Roman"/>
+          <w:sz w:val="28"/>
+          <w:szCs w:val="28"/>
+        </w:rPr>
+        <w:t xml:space="preserve"> off leaving the output unconnected from the input. This creating the state of high impedance (Z).</w:t>
       </w:r>
     </w:p>
     <w:p>
@@ -729,8 +873,18 @@
           <w:sz w:val="28"/>
           <w:szCs w:val="28"/>
         </w:rPr>
-        <w:t>This simulation is performed on LTSpice</w:t>
-      </w:r>
+        <w:t xml:space="preserve">This simulation is performed on </w:t>
+      </w:r>
+      <w:proofErr w:type="spellStart"/>
+      <w:r>
+        <w:rPr>
+          <w:rFonts w:ascii="Times New Roman" w:hAnsi="Times New Roman" w:cs="Times New Roman"/>
+          <w:sz w:val="28"/>
+          <w:szCs w:val="28"/>
+        </w:rPr>
+        <w:t>LTSpice</w:t>
+      </w:r>
+      <w:proofErr w:type="spellEnd"/>
     </w:p>
     <w:p>
       <w:pPr>
@@ -868,7 +1022,25 @@
           <w:sz w:val="28"/>
           <w:szCs w:val="28"/>
         </w:rPr>
-        <w:t>The upper portion of circuit contains the CMOS inverter and lower portion contains the transmission gate. Source of both the transistors is connected to VDD. In simulation, first waveform represents the input, second waveform represents the inverted input that is supplied to gate of pMOS and third waveform represents the output.</w:t>
+        <w:t xml:space="preserve">The upper portion of circuit contains the CMOS inverter and lower portion contains the transmission gate. Source of both the transistors is connected to VDD. In simulation, first waveform represents the input, second waveform represents the inverted input that is supplied to gate of </w:t>
+      </w:r>
+      <w:proofErr w:type="spellStart"/>
+      <w:r>
+        <w:rPr>
+          <w:rFonts w:ascii="Times New Roman" w:hAnsi="Times New Roman" w:cs="Times New Roman"/>
+          <w:sz w:val="28"/>
+          <w:szCs w:val="28"/>
+        </w:rPr>
+        <w:t>pMOS</w:t>
+      </w:r>
+      <w:proofErr w:type="spellEnd"/>
+      <w:r>
+        <w:rPr>
+          <w:rFonts w:ascii="Times New Roman" w:hAnsi="Times New Roman" w:cs="Times New Roman"/>
+          <w:sz w:val="28"/>
+          <w:szCs w:val="28"/>
+        </w:rPr>
+        <w:t xml:space="preserve"> and third waveform represents the output.</w:t>
       </w:r>
     </w:p>
     <w:p>
@@ -936,7 +1108,79 @@
           <w:sz w:val="28"/>
           <w:szCs w:val="28"/>
         </w:rPr>
-        <w:t xml:space="preserve">I learned that bulk pin of nMOS should be connected to ground and that of pMOS should be connected to high voltage, but for a standard MOSFET we have only three pins and this bulk pin is connected to the source pin inside the housing and hence can not be connected somewhere else. As learned from google, for making transmission gates ICs are used in which bulk of all nMOS </w:t>
+        <w:t xml:space="preserve">I learned that bulk pin of </w:t>
+      </w:r>
+      <w:proofErr w:type="spellStart"/>
+      <w:r>
+        <w:rPr>
+          <w:rFonts w:ascii="Times New Roman" w:hAnsi="Times New Roman" w:cs="Times New Roman"/>
+          <w:sz w:val="28"/>
+          <w:szCs w:val="28"/>
+        </w:rPr>
+        <w:t>nMOS</w:t>
+      </w:r>
+      <w:proofErr w:type="spellEnd"/>
+      <w:r>
+        <w:rPr>
+          <w:rFonts w:ascii="Times New Roman" w:hAnsi="Times New Roman" w:cs="Times New Roman"/>
+          <w:sz w:val="28"/>
+          <w:szCs w:val="28"/>
+        </w:rPr>
+        <w:t xml:space="preserve"> should be connected to ground and that of </w:t>
+      </w:r>
+      <w:proofErr w:type="spellStart"/>
+      <w:r>
+        <w:rPr>
+          <w:rFonts w:ascii="Times New Roman" w:hAnsi="Times New Roman" w:cs="Times New Roman"/>
+          <w:sz w:val="28"/>
+          <w:szCs w:val="28"/>
+        </w:rPr>
+        <w:t>pMOS</w:t>
+      </w:r>
+      <w:proofErr w:type="spellEnd"/>
+      <w:r>
+        <w:rPr>
+          <w:rFonts w:ascii="Times New Roman" w:hAnsi="Times New Roman" w:cs="Times New Roman"/>
+          <w:sz w:val="28"/>
+          <w:szCs w:val="28"/>
+        </w:rPr>
+        <w:t xml:space="preserve"> should be connected to high voltage, but for a standard MOSFET we have only three pins and this bulk pin is connected to the source pin inside the housing and hence </w:t>
+      </w:r>
+      <w:proofErr w:type="spellStart"/>
+      <w:r>
+        <w:rPr>
+          <w:rFonts w:ascii="Times New Roman" w:hAnsi="Times New Roman" w:cs="Times New Roman"/>
+          <w:sz w:val="28"/>
+          <w:szCs w:val="28"/>
+        </w:rPr>
+        <w:t>can not</w:t>
+      </w:r>
+      <w:proofErr w:type="spellEnd"/>
+      <w:r>
+        <w:rPr>
+          <w:rFonts w:ascii="Times New Roman" w:hAnsi="Times New Roman" w:cs="Times New Roman"/>
+          <w:sz w:val="28"/>
+          <w:szCs w:val="28"/>
+        </w:rPr>
+        <w:t xml:space="preserve"> be connected somewhere else. As learned from google, for making transmission gates ICs are used in which bulk of all </w:t>
+      </w:r>
+      <w:proofErr w:type="spellStart"/>
+      <w:r>
+        <w:rPr>
+          <w:rFonts w:ascii="Times New Roman" w:hAnsi="Times New Roman" w:cs="Times New Roman"/>
+          <w:sz w:val="28"/>
+          <w:szCs w:val="28"/>
+        </w:rPr>
+        <w:t>nMOS</w:t>
+      </w:r>
+      <w:proofErr w:type="spellEnd"/>
+      <w:r>
+        <w:rPr>
+          <w:rFonts w:ascii="Times New Roman" w:hAnsi="Times New Roman" w:cs="Times New Roman"/>
+          <w:sz w:val="28"/>
+          <w:szCs w:val="28"/>
+        </w:rPr>
+        <w:t xml:space="preserve"> </w:t>
       </w:r>
       <w:r>
         <w:rPr>
@@ -952,7 +1196,25 @@
           <w:sz w:val="28"/>
           <w:szCs w:val="28"/>
         </w:rPr>
-        <w:t xml:space="preserve">is connected to ground/ lowest voltage and bulk pin of all pMOS </w:t>
+        <w:t xml:space="preserve">is connected to ground/ lowest voltage and bulk pin of all </w:t>
+      </w:r>
+      <w:proofErr w:type="spellStart"/>
+      <w:r>
+        <w:rPr>
+          <w:rFonts w:ascii="Times New Roman" w:hAnsi="Times New Roman" w:cs="Times New Roman"/>
+          <w:sz w:val="28"/>
+          <w:szCs w:val="28"/>
+        </w:rPr>
+        <w:t>pMOS</w:t>
+      </w:r>
+      <w:proofErr w:type="spellEnd"/>
+      <w:r>
+        <w:rPr>
+          <w:rFonts w:ascii="Times New Roman" w:hAnsi="Times New Roman" w:cs="Times New Roman"/>
+          <w:sz w:val="28"/>
+          <w:szCs w:val="28"/>
+        </w:rPr>
+        <w:t xml:space="preserve"> </w:t>
       </w:r>
       <w:r>
         <w:rPr>
@@ -1020,7 +1282,25 @@
           <w:sz w:val="28"/>
           <w:szCs w:val="28"/>
         </w:rPr>
-        <w:t>Finally, learned to create symbol in LTSpice. Created a symbol for CMOS inverter to simplify the circuit. Now replaced the inverter inside transmission gate with the inverter symbol.</w:t>
+        <w:t xml:space="preserve">Finally, learned to create symbol in </w:t>
+      </w:r>
+      <w:proofErr w:type="spellStart"/>
+      <w:r>
+        <w:rPr>
+          <w:rFonts w:ascii="Times New Roman" w:hAnsi="Times New Roman" w:cs="Times New Roman"/>
+          <w:sz w:val="28"/>
+          <w:szCs w:val="28"/>
+        </w:rPr>
+        <w:t>LTSpice</w:t>
+      </w:r>
+      <w:proofErr w:type="spellEnd"/>
+      <w:r>
+        <w:rPr>
+          <w:rFonts w:ascii="Times New Roman" w:hAnsi="Times New Roman" w:cs="Times New Roman"/>
+          <w:sz w:val="28"/>
+          <w:szCs w:val="28"/>
+        </w:rPr>
+        <w:t>. Created a symbol for CMOS inverter to simplify the circuit. Now replaced the inverter inside transmission gate with the inverter symbol.</w:t>
       </w:r>
     </w:p>
     <w:p>
@@ -1232,7 +1512,25 @@
           <w:sz w:val="28"/>
           <w:szCs w:val="28"/>
         </w:rPr>
-        <w:t>And of course output remains the same.</w:t>
+        <w:t xml:space="preserve">And </w:t>
+      </w:r>
+      <w:proofErr w:type="gramStart"/>
+      <w:r>
+        <w:rPr>
+          <w:rFonts w:ascii="Times New Roman" w:hAnsi="Times New Roman" w:cs="Times New Roman"/>
+          <w:sz w:val="28"/>
+          <w:szCs w:val="28"/>
+        </w:rPr>
+        <w:t>of course</w:t>
+      </w:r>
+      <w:proofErr w:type="gramEnd"/>
+      <w:r>
+        <w:rPr>
+          <w:rFonts w:ascii="Times New Roman" w:hAnsi="Times New Roman" w:cs="Times New Roman"/>
+          <w:sz w:val="28"/>
+          <w:szCs w:val="28"/>
+        </w:rPr>
+        <w:t xml:space="preserve"> output remains the same.</w:t>
       </w:r>
     </w:p>
     <w:p>
@@ -1396,6 +1694,7 @@
       <w:r>
         <w:rPr>
           <w:rFonts w:ascii="Times New Roman" w:hAnsi="Times New Roman" w:cs="Times New Roman"/>
+          <w:noProof/>
           <w:sz w:val="28"/>
           <w:szCs w:val="28"/>
         </w:rPr>
@@ -1466,6 +1765,7 @@
       <w:r>
         <w:rPr>
           <w:rFonts w:ascii="Times New Roman" w:hAnsi="Times New Roman" w:cs="Times New Roman"/>
+          <w:noProof/>
           <w:sz w:val="28"/>
           <w:szCs w:val="28"/>
         </w:rPr>
@@ -1522,7 +1822,43 @@
           <w:szCs w:val="28"/>
         </w:rPr>
         <w:lastRenderedPageBreak/>
-        <w:t xml:space="preserve">This symbol is a bit different from what I saw on google. On google, it has inputs pins, as a, b, ctrl and ~ctrl but in schematic behind this symbol ~ctrl is already connected and I have added pins for vdd and vgnd. </w:t>
+        <w:t xml:space="preserve">This symbol is a bit different from what I saw on google. On google, it has inputs pins, as a, b, ctrl and ~ctrl but in schematic behind this symbol ~ctrl is already connected and I have added pins for </w:t>
+      </w:r>
+      <w:proofErr w:type="spellStart"/>
+      <w:r>
+        <w:rPr>
+          <w:rFonts w:ascii="Times New Roman" w:hAnsi="Times New Roman" w:cs="Times New Roman"/>
+          <w:sz w:val="28"/>
+          <w:szCs w:val="28"/>
+        </w:rPr>
+        <w:t>vdd</w:t>
+      </w:r>
+      <w:proofErr w:type="spellEnd"/>
+      <w:r>
+        <w:rPr>
+          <w:rFonts w:ascii="Times New Roman" w:hAnsi="Times New Roman" w:cs="Times New Roman"/>
+          <w:sz w:val="28"/>
+          <w:szCs w:val="28"/>
+        </w:rPr>
+        <w:t xml:space="preserve"> and </w:t>
+      </w:r>
+      <w:proofErr w:type="spellStart"/>
+      <w:r>
+        <w:rPr>
+          <w:rFonts w:ascii="Times New Roman" w:hAnsi="Times New Roman" w:cs="Times New Roman"/>
+          <w:sz w:val="28"/>
+          <w:szCs w:val="28"/>
+        </w:rPr>
+        <w:t>vgnd</w:t>
+      </w:r>
+      <w:proofErr w:type="spellEnd"/>
+      <w:r>
+        <w:rPr>
+          <w:rFonts w:ascii="Times New Roman" w:hAnsi="Times New Roman" w:cs="Times New Roman"/>
+          <w:sz w:val="28"/>
+          <w:szCs w:val="28"/>
+        </w:rPr>
+        <w:t xml:space="preserve">. </w:t>
       </w:r>
     </w:p>
     <w:p>
@@ -1555,6 +1891,7 @@
       <w:r>
         <w:rPr>
           <w:rFonts w:ascii="Times New Roman" w:hAnsi="Times New Roman" w:cs="Times New Roman"/>
+          <w:noProof/>
           <w:sz w:val="28"/>
           <w:szCs w:val="28"/>
         </w:rPr>
@@ -1690,6 +2027,233 @@
         </w:rPr>
         <w:t>For simulation the output of the transmission has been pulled down using a 10 Mega Ohm resistor.</w:t>
       </w:r>
+      <w:r>
+        <w:rPr>
+          <w:rFonts w:ascii="Times New Roman" w:hAnsi="Times New Roman" w:cs="Times New Roman"/>
+          <w:sz w:val="28"/>
+          <w:szCs w:val="28"/>
+        </w:rPr>
+        <w:t xml:space="preserve"> </w:t>
+      </w:r>
+    </w:p>
+    <w:p>
+      <w:pPr>
+        <w:jc w:val="both"/>
+        <w:rPr>
+          <w:rFonts w:ascii="Times New Roman" w:hAnsi="Times New Roman" w:cs="Times New Roman"/>
+          <w:sz w:val="28"/>
+          <w:szCs w:val="28"/>
+        </w:rPr>
+      </w:pPr>
+      <w:r>
+        <w:rPr>
+          <w:rFonts w:ascii="Times New Roman" w:hAnsi="Times New Roman" w:cs="Times New Roman"/>
+          <w:sz w:val="28"/>
+          <w:szCs w:val="28"/>
+        </w:rPr>
+        <w:t>Just realized that it may be the case that we need to feed the ctrl and ~ctrl with two different signals. For such scenarios, updated the previous symbol as transmission_gate_2</w:t>
+      </w:r>
+    </w:p>
+    <w:p>
+      <w:pPr>
+        <w:jc w:val="both"/>
+        <w:rPr>
+          <w:rFonts w:ascii="Times New Roman" w:hAnsi="Times New Roman" w:cs="Times New Roman"/>
+          <w:sz w:val="28"/>
+          <w:szCs w:val="28"/>
+        </w:rPr>
+      </w:pPr>
+    </w:p>
+    <w:p>
+      <w:pPr>
+        <w:jc w:val="both"/>
+        <w:rPr>
+          <w:rFonts w:ascii="Times New Roman" w:hAnsi="Times New Roman" w:cs="Times New Roman"/>
+          <w:sz w:val="28"/>
+          <w:szCs w:val="28"/>
+        </w:rPr>
+      </w:pPr>
+      <w:r>
+        <w:rPr>
+          <w:rFonts w:ascii="Times New Roman" w:hAnsi="Times New Roman" w:cs="Times New Roman"/>
+          <w:sz w:val="28"/>
+          <w:szCs w:val="28"/>
+        </w:rPr>
+        <w:lastRenderedPageBreak/>
+        <w:drawing>
+          <wp:inline distT="0" distB="0" distL="0" distR="0" wp14:anchorId="7A81ABE9" wp14:editId="4BD08C74">
+            <wp:extent cx="3207327" cy="2886594"/>
+            <wp:effectExtent l="0" t="0" r="0" b="0"/>
+            <wp:docPr id="85224618" name="Picture 1"/>
+            <wp:cNvGraphicFramePr>
+              <a:graphicFrameLocks xmlns:a="http://schemas.openxmlformats.org/drawingml/2006/main" noChangeAspect="1"/>
+            </wp:cNvGraphicFramePr>
+            <a:graphic xmlns:a="http://schemas.openxmlformats.org/drawingml/2006/main">
+              <a:graphicData uri="http://schemas.openxmlformats.org/drawingml/2006/picture">
+                <pic:pic xmlns:pic="http://schemas.openxmlformats.org/drawingml/2006/picture">
+                  <pic:nvPicPr>
+                    <pic:cNvPr id="85224618" name=""/>
+                    <pic:cNvPicPr/>
+                  </pic:nvPicPr>
+                  <pic:blipFill>
+                    <a:blip r:embed="rId15"/>
+                    <a:stretch>
+                      <a:fillRect/>
+                    </a:stretch>
+                  </pic:blipFill>
+                  <pic:spPr>
+                    <a:xfrm>
+                      <a:off x="0" y="0"/>
+                      <a:ext cx="3212612" cy="2891350"/>
+                    </a:xfrm>
+                    <a:prstGeom prst="rect">
+                      <a:avLst/>
+                    </a:prstGeom>
+                  </pic:spPr>
+                </pic:pic>
+              </a:graphicData>
+            </a:graphic>
+          </wp:inline>
+        </w:drawing>
+      </w:r>
+    </w:p>
+    <w:p>
+      <w:pPr>
+        <w:jc w:val="both"/>
+        <w:rPr>
+          <w:rFonts w:ascii="Times New Roman" w:hAnsi="Times New Roman" w:cs="Times New Roman"/>
+          <w:sz w:val="28"/>
+          <w:szCs w:val="28"/>
+        </w:rPr>
+      </w:pPr>
+      <w:r>
+        <w:rPr>
+          <w:rFonts w:ascii="Times New Roman" w:hAnsi="Times New Roman" w:cs="Times New Roman"/>
+          <w:sz w:val="28"/>
+          <w:szCs w:val="28"/>
+        </w:rPr>
+        <w:t>Symbol with both ctrl and ~ctrl pins.</w:t>
+      </w:r>
+    </w:p>
+    <w:p>
+      <w:pPr>
+        <w:jc w:val="both"/>
+        <w:rPr>
+          <w:rFonts w:ascii="Times New Roman" w:hAnsi="Times New Roman" w:cs="Times New Roman"/>
+          <w:sz w:val="28"/>
+          <w:szCs w:val="28"/>
+        </w:rPr>
+      </w:pPr>
+    </w:p>
+    <w:p>
+      <w:pPr>
+        <w:jc w:val="both"/>
+        <w:rPr>
+          <w:rFonts w:ascii="Times New Roman" w:hAnsi="Times New Roman" w:cs="Times New Roman"/>
+          <w:sz w:val="28"/>
+          <w:szCs w:val="28"/>
+        </w:rPr>
+      </w:pPr>
+    </w:p>
+    <w:p>
+      <w:pPr>
+        <w:jc w:val="both"/>
+        <w:rPr>
+          <w:rFonts w:ascii="Times New Roman" w:hAnsi="Times New Roman" w:cs="Times New Roman"/>
+          <w:sz w:val="28"/>
+          <w:szCs w:val="28"/>
+        </w:rPr>
+      </w:pPr>
+    </w:p>
+    <w:p>
+      <w:pPr>
+        <w:jc w:val="both"/>
+        <w:rPr>
+          <w:rFonts w:ascii="Times New Roman" w:hAnsi="Times New Roman" w:cs="Times New Roman"/>
+          <w:sz w:val="28"/>
+          <w:szCs w:val="28"/>
+        </w:rPr>
+      </w:pPr>
+    </w:p>
+    <w:p>
+      <w:pPr>
+        <w:jc w:val="both"/>
+        <w:rPr>
+          <w:rFonts w:ascii="Times New Roman" w:hAnsi="Times New Roman" w:cs="Times New Roman"/>
+          <w:sz w:val="28"/>
+          <w:szCs w:val="28"/>
+        </w:rPr>
+      </w:pPr>
+    </w:p>
+    <w:p>
+      <w:pPr>
+        <w:jc w:val="both"/>
+        <w:rPr>
+          <w:rFonts w:ascii="Times New Roman" w:hAnsi="Times New Roman" w:cs="Times New Roman"/>
+          <w:sz w:val="28"/>
+          <w:szCs w:val="28"/>
+        </w:rPr>
+      </w:pPr>
+    </w:p>
+    <w:p>
+      <w:pPr>
+        <w:jc w:val="both"/>
+        <w:rPr>
+          <w:rFonts w:ascii="Times New Roman" w:hAnsi="Times New Roman" w:cs="Times New Roman"/>
+          <w:sz w:val="28"/>
+          <w:szCs w:val="28"/>
+        </w:rPr>
+      </w:pPr>
+    </w:p>
+    <w:p>
+      <w:pPr>
+        <w:jc w:val="both"/>
+        <w:rPr>
+          <w:rFonts w:ascii="Times New Roman" w:hAnsi="Times New Roman" w:cs="Times New Roman"/>
+          <w:sz w:val="28"/>
+          <w:szCs w:val="28"/>
+        </w:rPr>
+      </w:pPr>
+    </w:p>
+    <w:p>
+      <w:pPr>
+        <w:jc w:val="both"/>
+        <w:rPr>
+          <w:rFonts w:ascii="Times New Roman" w:hAnsi="Times New Roman" w:cs="Times New Roman"/>
+          <w:sz w:val="28"/>
+          <w:szCs w:val="28"/>
+        </w:rPr>
+      </w:pPr>
+    </w:p>
+    <w:p>
+      <w:pPr>
+        <w:jc w:val="both"/>
+        <w:rPr>
+          <w:rFonts w:ascii="Times New Roman" w:hAnsi="Times New Roman" w:cs="Times New Roman"/>
+          <w:sz w:val="28"/>
+          <w:szCs w:val="28"/>
+        </w:rPr>
+      </w:pPr>
+    </w:p>
+    <w:p>
+      <w:pPr>
+        <w:jc w:val="both"/>
+        <w:rPr>
+          <w:rFonts w:ascii="Times New Roman" w:hAnsi="Times New Roman" w:cs="Times New Roman"/>
+          <w:sz w:val="28"/>
+          <w:szCs w:val="28"/>
+        </w:rPr>
+      </w:pPr>
+    </w:p>
+    <w:p>
+      <w:pPr>
+        <w:jc w:val="both"/>
+        <w:rPr>
+          <w:rFonts w:ascii="Times New Roman" w:hAnsi="Times New Roman" w:cs="Times New Roman"/>
+          <w:sz w:val="28"/>
+          <w:szCs w:val="28"/>
+        </w:rPr>
+      </w:pPr>
     </w:p>
     <w:p>
       <w:pPr>

</xml_diff>

<commit_message>
Created D latch using mux and inverters
</commit_message>
<xml_diff>
--- a/Transmission Gate.docx
+++ b/Transmission Gate.docx
@@ -61,43 +61,7 @@
           <w:sz w:val="28"/>
           <w:szCs w:val="28"/>
         </w:rPr>
-        <w:t xml:space="preserve">Since, </w:t>
-      </w:r>
-      <w:proofErr w:type="spellStart"/>
-      <w:r>
-        <w:rPr>
-          <w:rFonts w:ascii="Times New Roman" w:hAnsi="Times New Roman" w:cs="Times New Roman"/>
-          <w:sz w:val="28"/>
-          <w:szCs w:val="28"/>
-        </w:rPr>
-        <w:t>nMOS</w:t>
-      </w:r>
-      <w:proofErr w:type="spellEnd"/>
-      <w:r>
-        <w:rPr>
-          <w:rFonts w:ascii="Times New Roman" w:hAnsi="Times New Roman" w:cs="Times New Roman"/>
-          <w:sz w:val="28"/>
-          <w:szCs w:val="28"/>
-        </w:rPr>
-        <w:t xml:space="preserve"> acts as a perfect switch for logic 0 and </w:t>
-      </w:r>
-      <w:proofErr w:type="spellStart"/>
-      <w:r>
-        <w:rPr>
-          <w:rFonts w:ascii="Times New Roman" w:hAnsi="Times New Roman" w:cs="Times New Roman"/>
-          <w:sz w:val="28"/>
-          <w:szCs w:val="28"/>
-        </w:rPr>
-        <w:t>pMOS</w:t>
-      </w:r>
-      <w:proofErr w:type="spellEnd"/>
-      <w:r>
-        <w:rPr>
-          <w:rFonts w:ascii="Times New Roman" w:hAnsi="Times New Roman" w:cs="Times New Roman"/>
-          <w:sz w:val="28"/>
-          <w:szCs w:val="28"/>
-        </w:rPr>
-        <w:t xml:space="preserve"> acts as a perfect switch for logic 1. A transmission gate contains a combination of both.</w:t>
+        <w:t>Since, nMOS acts as a perfect switch for logic 0 and pMOS acts as a perfect switch for logic 1. A transmission gate contains a combination of both.</w:t>
       </w:r>
       <w:r>
         <w:rPr>
@@ -246,97 +210,7 @@
           <w:sz w:val="28"/>
           <w:szCs w:val="28"/>
         </w:rPr>
-        <w:t xml:space="preserve">When logic 1 is applied to control signal, </w:t>
-      </w:r>
-      <w:proofErr w:type="spellStart"/>
-      <w:r>
-        <w:rPr>
-          <w:rFonts w:ascii="Times New Roman" w:hAnsi="Times New Roman" w:cs="Times New Roman"/>
-          <w:sz w:val="28"/>
-          <w:szCs w:val="28"/>
-        </w:rPr>
-        <w:t>nMOS</w:t>
-      </w:r>
-      <w:proofErr w:type="spellEnd"/>
-      <w:r>
-        <w:rPr>
-          <w:rFonts w:ascii="Times New Roman" w:hAnsi="Times New Roman" w:cs="Times New Roman"/>
-          <w:sz w:val="28"/>
-          <w:szCs w:val="28"/>
-        </w:rPr>
-        <w:t xml:space="preserve"> turns ON and due to inverter connected to </w:t>
-      </w:r>
-      <w:proofErr w:type="spellStart"/>
-      <w:r>
-        <w:rPr>
-          <w:rFonts w:ascii="Times New Roman" w:hAnsi="Times New Roman" w:cs="Times New Roman"/>
-          <w:sz w:val="28"/>
-          <w:szCs w:val="28"/>
-        </w:rPr>
-        <w:t>pMOS</w:t>
-      </w:r>
-      <w:proofErr w:type="spellEnd"/>
-      <w:r>
-        <w:rPr>
-          <w:rFonts w:ascii="Times New Roman" w:hAnsi="Times New Roman" w:cs="Times New Roman"/>
-          <w:sz w:val="28"/>
-          <w:szCs w:val="28"/>
-        </w:rPr>
-        <w:t xml:space="preserve">, </w:t>
-      </w:r>
-      <w:proofErr w:type="spellStart"/>
-      <w:r>
-        <w:rPr>
-          <w:rFonts w:ascii="Times New Roman" w:hAnsi="Times New Roman" w:cs="Times New Roman"/>
-          <w:sz w:val="28"/>
-          <w:szCs w:val="28"/>
-        </w:rPr>
-        <w:t>pMOS</w:t>
-      </w:r>
-      <w:proofErr w:type="spellEnd"/>
-      <w:r>
-        <w:rPr>
-          <w:rFonts w:ascii="Times New Roman" w:hAnsi="Times New Roman" w:cs="Times New Roman"/>
-          <w:sz w:val="28"/>
-          <w:szCs w:val="28"/>
-        </w:rPr>
-        <w:t xml:space="preserve"> receives logic 0 and it also turns on. If source is connected to logic 0 then </w:t>
-      </w:r>
-      <w:proofErr w:type="spellStart"/>
-      <w:r>
-        <w:rPr>
-          <w:rFonts w:ascii="Times New Roman" w:hAnsi="Times New Roman" w:cs="Times New Roman"/>
-          <w:sz w:val="28"/>
-          <w:szCs w:val="28"/>
-        </w:rPr>
-        <w:t>nMOS</w:t>
-      </w:r>
-      <w:proofErr w:type="spellEnd"/>
-      <w:r>
-        <w:rPr>
-          <w:rFonts w:ascii="Times New Roman" w:hAnsi="Times New Roman" w:cs="Times New Roman"/>
-          <w:sz w:val="28"/>
-          <w:szCs w:val="28"/>
-        </w:rPr>
-        <w:t xml:space="preserve"> acts as perfect switch and if source is connected to logic 1 then </w:t>
-      </w:r>
-      <w:proofErr w:type="spellStart"/>
-      <w:r>
-        <w:rPr>
-          <w:rFonts w:ascii="Times New Roman" w:hAnsi="Times New Roman" w:cs="Times New Roman"/>
-          <w:sz w:val="28"/>
-          <w:szCs w:val="28"/>
-        </w:rPr>
-        <w:t>pMOS</w:t>
-      </w:r>
-      <w:proofErr w:type="spellEnd"/>
-      <w:r>
-        <w:rPr>
-          <w:rFonts w:ascii="Times New Roman" w:hAnsi="Times New Roman" w:cs="Times New Roman"/>
-          <w:sz w:val="28"/>
-          <w:szCs w:val="28"/>
-        </w:rPr>
-        <w:t xml:space="preserve"> acts as a perfect switch and signal is transferred from source to drain without degradation. When logic 0 is applied to control signal, both the transistors turns off leaving the output unconnected from the input. This creating the state of high impedance (Z).</w:t>
+        <w:t>When logic 1 is applied to control signal, nMOS turns ON and due to inverter connected to pMOS, pMOS receives logic 0 and it also turns on. If source is connected to logic 0 then nMOS acts as perfect switch and if source is connected to logic 1 then pMOS acts as a perfect switch and signal is transferred from source to drain without degradation. When logic 0 is applied to control signal, both the transistors turns off leaving the output unconnected from the input. This creating the state of high impedance (Z).</w:t>
       </w:r>
     </w:p>
     <w:p>
@@ -855,18 +729,8 @@
           <w:sz w:val="28"/>
           <w:szCs w:val="28"/>
         </w:rPr>
-        <w:t xml:space="preserve">This simulation is performed on </w:t>
-      </w:r>
-      <w:proofErr w:type="spellStart"/>
-      <w:r>
-        <w:rPr>
-          <w:rFonts w:ascii="Times New Roman" w:hAnsi="Times New Roman" w:cs="Times New Roman"/>
-          <w:sz w:val="28"/>
-          <w:szCs w:val="28"/>
-        </w:rPr>
-        <w:t>LTSpice</w:t>
-      </w:r>
-      <w:proofErr w:type="spellEnd"/>
+        <w:t>This simulation is performed on LTSpice</w:t>
+      </w:r>
     </w:p>
     <w:p>
       <w:pPr>
@@ -1004,25 +868,7 @@
           <w:sz w:val="28"/>
           <w:szCs w:val="28"/>
         </w:rPr>
-        <w:t xml:space="preserve">The upper portion of circuit contains the CMOS inverter and lower portion contains the transmission gate. Source of both the transistors is connected to VDD. In simulation, first waveform represents the input, second waveform represents the inverted input that is supplied to gate of </w:t>
-      </w:r>
-      <w:proofErr w:type="spellStart"/>
-      <w:r>
-        <w:rPr>
-          <w:rFonts w:ascii="Times New Roman" w:hAnsi="Times New Roman" w:cs="Times New Roman"/>
-          <w:sz w:val="28"/>
-          <w:szCs w:val="28"/>
-        </w:rPr>
-        <w:t>pMOS</w:t>
-      </w:r>
-      <w:proofErr w:type="spellEnd"/>
-      <w:r>
-        <w:rPr>
-          <w:rFonts w:ascii="Times New Roman" w:hAnsi="Times New Roman" w:cs="Times New Roman"/>
-          <w:sz w:val="28"/>
-          <w:szCs w:val="28"/>
-        </w:rPr>
-        <w:t xml:space="preserve"> and third waveform represents the output.</w:t>
+        <w:t>The upper portion of circuit contains the CMOS inverter and lower portion contains the transmission gate. Source of both the transistors is connected to VDD. In simulation, first waveform represents the input, second waveform represents the inverted input that is supplied to gate of pMOS and third waveform represents the output.</w:t>
       </w:r>
     </w:p>
     <w:p>
@@ -1090,79 +936,7 @@
           <w:sz w:val="28"/>
           <w:szCs w:val="28"/>
         </w:rPr>
-        <w:t xml:space="preserve">I learned that bulk pin of </w:t>
-      </w:r>
-      <w:proofErr w:type="spellStart"/>
-      <w:r>
-        <w:rPr>
-          <w:rFonts w:ascii="Times New Roman" w:hAnsi="Times New Roman" w:cs="Times New Roman"/>
-          <w:sz w:val="28"/>
-          <w:szCs w:val="28"/>
-        </w:rPr>
-        <w:t>nMOS</w:t>
-      </w:r>
-      <w:proofErr w:type="spellEnd"/>
-      <w:r>
-        <w:rPr>
-          <w:rFonts w:ascii="Times New Roman" w:hAnsi="Times New Roman" w:cs="Times New Roman"/>
-          <w:sz w:val="28"/>
-          <w:szCs w:val="28"/>
-        </w:rPr>
-        <w:t xml:space="preserve"> should be connected to ground and that of </w:t>
-      </w:r>
-      <w:proofErr w:type="spellStart"/>
-      <w:r>
-        <w:rPr>
-          <w:rFonts w:ascii="Times New Roman" w:hAnsi="Times New Roman" w:cs="Times New Roman"/>
-          <w:sz w:val="28"/>
-          <w:szCs w:val="28"/>
-        </w:rPr>
-        <w:t>pMOS</w:t>
-      </w:r>
-      <w:proofErr w:type="spellEnd"/>
-      <w:r>
-        <w:rPr>
-          <w:rFonts w:ascii="Times New Roman" w:hAnsi="Times New Roman" w:cs="Times New Roman"/>
-          <w:sz w:val="28"/>
-          <w:szCs w:val="28"/>
-        </w:rPr>
-        <w:t xml:space="preserve"> should be connected to high voltage, but for a standard MOSFET we have only three pins and this bulk pin is connected to the source pin inside the housing and hence </w:t>
-      </w:r>
-      <w:proofErr w:type="spellStart"/>
-      <w:r>
-        <w:rPr>
-          <w:rFonts w:ascii="Times New Roman" w:hAnsi="Times New Roman" w:cs="Times New Roman"/>
-          <w:sz w:val="28"/>
-          <w:szCs w:val="28"/>
-        </w:rPr>
-        <w:t>can not</w:t>
-      </w:r>
-      <w:proofErr w:type="spellEnd"/>
-      <w:r>
-        <w:rPr>
-          <w:rFonts w:ascii="Times New Roman" w:hAnsi="Times New Roman" w:cs="Times New Roman"/>
-          <w:sz w:val="28"/>
-          <w:szCs w:val="28"/>
-        </w:rPr>
-        <w:t xml:space="preserve"> be connected somewhere else. As learned from google, for making transmission gates ICs are used in which bulk of all </w:t>
-      </w:r>
-      <w:proofErr w:type="spellStart"/>
-      <w:r>
-        <w:rPr>
-          <w:rFonts w:ascii="Times New Roman" w:hAnsi="Times New Roman" w:cs="Times New Roman"/>
-          <w:sz w:val="28"/>
-          <w:szCs w:val="28"/>
-        </w:rPr>
-        <w:t>nMOS</w:t>
-      </w:r>
-      <w:proofErr w:type="spellEnd"/>
-      <w:r>
-        <w:rPr>
-          <w:rFonts w:ascii="Times New Roman" w:hAnsi="Times New Roman" w:cs="Times New Roman"/>
-          <w:sz w:val="28"/>
-          <w:szCs w:val="28"/>
-        </w:rPr>
-        <w:t xml:space="preserve"> </w:t>
+        <w:t xml:space="preserve">I learned that bulk pin of nMOS should be connected to ground and that of pMOS should be connected to high voltage, but for a standard MOSFET we have only three pins and this bulk pin is connected to the source pin inside the housing and hence can not be connected somewhere else. As learned from google, for making transmission gates ICs are used in which bulk of all nMOS </w:t>
       </w:r>
       <w:r>
         <w:rPr>
@@ -1178,25 +952,7 @@
           <w:sz w:val="28"/>
           <w:szCs w:val="28"/>
         </w:rPr>
-        <w:t xml:space="preserve">is connected to ground/ lowest voltage and bulk pin of all </w:t>
-      </w:r>
-      <w:proofErr w:type="spellStart"/>
-      <w:r>
-        <w:rPr>
-          <w:rFonts w:ascii="Times New Roman" w:hAnsi="Times New Roman" w:cs="Times New Roman"/>
-          <w:sz w:val="28"/>
-          <w:szCs w:val="28"/>
-        </w:rPr>
-        <w:t>pMOS</w:t>
-      </w:r>
-      <w:proofErr w:type="spellEnd"/>
-      <w:r>
-        <w:rPr>
-          <w:rFonts w:ascii="Times New Roman" w:hAnsi="Times New Roman" w:cs="Times New Roman"/>
-          <w:sz w:val="28"/>
-          <w:szCs w:val="28"/>
-        </w:rPr>
-        <w:t xml:space="preserve"> </w:t>
+        <w:t xml:space="preserve">is connected to ground/ lowest voltage and bulk pin of all pMOS </w:t>
       </w:r>
       <w:r>
         <w:rPr>
@@ -1264,25 +1020,7 @@
           <w:sz w:val="28"/>
           <w:szCs w:val="28"/>
         </w:rPr>
-        <w:t xml:space="preserve">Finally, learned to create symbol in </w:t>
-      </w:r>
-      <w:proofErr w:type="spellStart"/>
-      <w:r>
-        <w:rPr>
-          <w:rFonts w:ascii="Times New Roman" w:hAnsi="Times New Roman" w:cs="Times New Roman"/>
-          <w:sz w:val="28"/>
-          <w:szCs w:val="28"/>
-        </w:rPr>
-        <w:t>LTSpice</w:t>
-      </w:r>
-      <w:proofErr w:type="spellEnd"/>
-      <w:r>
-        <w:rPr>
-          <w:rFonts w:ascii="Times New Roman" w:hAnsi="Times New Roman" w:cs="Times New Roman"/>
-          <w:sz w:val="28"/>
-          <w:szCs w:val="28"/>
-        </w:rPr>
-        <w:t>. Created a symbol for CMOS inverter to simplify the circuit. Now replaced the inverter inside transmission gate with the inverter symbol.</w:t>
+        <w:t>Finally, learned to create symbol in LTSpice. Created a symbol for CMOS inverter to simplify the circuit. Now replaced the inverter inside transmission gate with the inverter symbol.</w:t>
       </w:r>
     </w:p>
     <w:p>
@@ -1786,43 +1524,7 @@
           <w:szCs w:val="28"/>
         </w:rPr>
         <w:lastRenderedPageBreak/>
-        <w:t xml:space="preserve">This symbol is a bit different from what I saw on google. On google, it has inputs pins, as a, b, ctrl and ~ctrl but in schematic behind this symbol ~ctrl is already connected and I have added pins for </w:t>
-      </w:r>
-      <w:proofErr w:type="spellStart"/>
-      <w:r>
-        <w:rPr>
-          <w:rFonts w:ascii="Times New Roman" w:hAnsi="Times New Roman" w:cs="Times New Roman"/>
-          <w:sz w:val="28"/>
-          <w:szCs w:val="28"/>
-        </w:rPr>
-        <w:t>vdd</w:t>
-      </w:r>
-      <w:proofErr w:type="spellEnd"/>
-      <w:r>
-        <w:rPr>
-          <w:rFonts w:ascii="Times New Roman" w:hAnsi="Times New Roman" w:cs="Times New Roman"/>
-          <w:sz w:val="28"/>
-          <w:szCs w:val="28"/>
-        </w:rPr>
-        <w:t xml:space="preserve"> and </w:t>
-      </w:r>
-      <w:proofErr w:type="spellStart"/>
-      <w:r>
-        <w:rPr>
-          <w:rFonts w:ascii="Times New Roman" w:hAnsi="Times New Roman" w:cs="Times New Roman"/>
-          <w:sz w:val="28"/>
-          <w:szCs w:val="28"/>
-        </w:rPr>
-        <w:t>vgnd</w:t>
-      </w:r>
-      <w:proofErr w:type="spellEnd"/>
-      <w:r>
-        <w:rPr>
-          <w:rFonts w:ascii="Times New Roman" w:hAnsi="Times New Roman" w:cs="Times New Roman"/>
-          <w:sz w:val="28"/>
-          <w:szCs w:val="28"/>
-        </w:rPr>
-        <w:t xml:space="preserve">. </w:t>
+        <w:t xml:space="preserve">This symbol is a bit different from what I saw on google. On google, it has inputs pins, as a, b, ctrl and ~ctrl but in schematic behind this symbol ~ctrl is already connected and I have added pins for vdd and vgnd. </w:t>
       </w:r>
     </w:p>
     <w:p>
@@ -2239,26 +1941,6 @@
           <w:szCs w:val="28"/>
         </w:rPr>
       </w:pPr>
-    </w:p>
-    <w:p>
-      <w:pPr>
-        <w:jc w:val="both"/>
-        <w:rPr>
-          <w:rFonts w:ascii="Times New Roman" w:hAnsi="Times New Roman" w:cs="Times New Roman"/>
-          <w:sz w:val="28"/>
-          <w:szCs w:val="28"/>
-        </w:rPr>
-      </w:pPr>
-    </w:p>
-    <w:p>
-      <w:pPr>
-        <w:jc w:val="both"/>
-        <w:rPr>
-          <w:rFonts w:ascii="Times New Roman" w:hAnsi="Times New Roman" w:cs="Times New Roman"/>
-          <w:sz w:val="28"/>
-          <w:szCs w:val="28"/>
-        </w:rPr>
-      </w:pPr>
       <w:r>
         <w:rPr>
           <w:rFonts w:ascii="Times New Roman" w:hAnsi="Times New Roman" w:cs="Times New Roman"/>
@@ -2283,7 +1965,6 @@
           <w:sz w:val="28"/>
           <w:szCs w:val="28"/>
         </w:rPr>
-        <w:lastRenderedPageBreak/>
         <w:t>MADHUSUDAN</w:t>
       </w:r>
     </w:p>

</xml_diff>